<commit_message>
Restructure epidural ultrasound referat
Co-authored-by: rsusenoaji <315754274+rsusenoaji@users.noreply.github.com>
</commit_message>
<xml_diff>
--- a/REFERAT_PENGGUNAAN_USG_BLOK_EPIDURAL.docx
+++ b/REFERAT_PENGGUNAAN_USG_BLOK_EPIDURAL.docx
@@ -44,7 +44,7 @@
           <w:i w:val="0"/>
           <w:sz w:val="24"/>
         </w:rPr>
-        <w:t xml:space="preserve">Blok epidural merupakan teknik anestesi regional neuraksial yang banyak digunakan untuk anestesi pembedahan, analgesia perioperatif, dan analgesia obstetri. Namun, keberhasilan teknik konvensional masih dipengaruhi ketepatan palpasi penanda anatomi permukaan, pengalaman operator, serta variasi anatomi pasien. Pada pasien obesitas, perubahan degeneratif tulang belakang, atau penanda anatomi yang sulit diraba, teknik berbasis penanda anatomi permukaan tubuh dan </w:t>
+        <w:t xml:space="preserve">Blok epidural merupakan teknik anestesi regional neuraksial yang luas digunakan untuk anestesi pembedahan, analgesia perioperatif, dan analgesia persalinan. Namun, keberhasilan teknik konvensional masih sangat dipengaruhi oleh ketepatan identifikasi penanda anatomi permukaan, pengalaman operator, dan variasi anatomi pasien. Pada pasien obesitas, pasien dengan perubahan degeneratif tulang belakang, serta pasien dengan anatomi sulit, teknik berbasis penanda anatomi permukaan dan </w:t>
       </w:r>
       <w:r>
         <w:rPr>
@@ -62,7 +62,7 @@
           <w:i w:val="0"/>
           <w:sz w:val="24"/>
         </w:rPr>
-        <w:t xml:space="preserve"> berisiko meningkatkan jumlah tusukan, perubahan arah jarum, kegagalan blok, dan komplikasi. Ultrasonografi neuraksial memberikan bantuan melalui identifikasi celah intervertebra, garis tengah, estimasi kedalaman ruang epidural, serta penentuan arah insersi jarum yang lebih tepat. Referat ini membahas anatomi neuraksial dan ruang epidural, keterbatasan teknik epidural konvensional, prinsip dasar dan aspek teknis ultrasonografi neuraksial, prosedur panduan ultrasonografi sebelum tindakan dan secara </w:t>
+        <w:t xml:space="preserve"> dapat meningkatkan jumlah tusukan, perubahan arah jarum, kegagalan blok, dan komplikasi. Ultrasonografi neuraksial memberikan bantuan melalui identifikasi </w:t>
       </w:r>
       <w:r>
         <w:rPr>
@@ -71,7 +71,7 @@
           <w:i/>
           <w:sz w:val="24"/>
         </w:rPr>
-        <w:t>real-time</w:t>
+        <w:t>interspace</w:t>
       </w:r>
       <w:r>
         <w:rPr>
@@ -80,7 +80,7 @@
           <w:i w:val="0"/>
           <w:sz w:val="24"/>
         </w:rPr>
-        <w:t>, serta penerapannya pada populasi dengan anatomi sulit. Berdasarkan sumber yang ditelaah, ultrasonografi sebelum tindakan secara umum meningkatkan keberhasilan tusukan pertama, menurunkan jumlah percobaan, dan paling bermanfaat pada kasus yang diperkirakan sulit, terutama pada pasien obstetri dan pasien dengan penanda anatomi yang buruk. Dengan demikian, ultrasonografi merupakan alat bantu yang penting untuk meningkatkan keberhasilan, efisiensi, dan keselamatan tindakan blok epidural bila digunakan secara sistematis oleh operator yang terlatih.[1-4]</w:t>
+        <w:t xml:space="preserve"> vertebra, garis tengah, perkiraan kedalaman ruang epidural, dan penentuan trajektori insersi jarum yang lebih tepat. Referat ini membahas anatomi neuraksial dan ruang epidural, keterbatasan teknik konvensional, prinsip dasar dan aspek teknis ultrasonografi neuraksial, prosedur panduan ultrasonografi, serta penggunaannya pada populasi dengan anatomi sulit. Berdasarkan sumber yang ditelaah, ultrasonografi sebelum tindakan secara umum meningkatkan keberhasilan tusukan pertama, menurunkan jumlah percobaan, dan paling bermanfaat pada prosedur yang diperkirakan sulit, terutama pada pasien obstetri dan pasien dengan penanda anatomi yang tidak jelas. Dengan demikian, ultrasonografi merupakan alat bantu yang bernilai untuk meningkatkan keberhasilan, efisiensi, dan keselamatan tindakan blok epidural.[1-4]</w:t>
       </w:r>
     </w:p>
     <w:p/>
@@ -152,7 +152,7 @@
           <w:i w:val="0"/>
           <w:sz w:val="24"/>
         </w:rPr>
-        <w:t>Epidural block is a widely used neuraxial regional anesthetic technique for surgical anesthesia, perioperative analgesia, and obstetric analgesia. Nevertheless, the success of the conventional technique still depends on accurate landmark palpation, operator experience, and patient anatomical variation. In obese patients, those with degenerative spinal changes, or those with poorly palpable landmarks, surface landmark-based and loss-of-resistance techniques may increase the number of needle passes, redirections, block failure, and complications. Neuraxial ultrasound provides assistance by identifying the intervertebral space, midline, estimated epidural depth, and the optimal direction of needle insertion. This paper reviews neuraxial anatomy and the epidural space, limitations of conventional epidural techniques, the basic principles and technical aspects of neuraxial ultrasound, pre-procedural and real-time ultrasound guidance, and its use in patients with difficult anatomy. Based on the reviewed sources, pre-procedural ultrasound generally improves first-attempt success, reduces the number of attempts, and is especially beneficial in predicted difficult cases, particularly in obstetric patients and in patients with poorly palpable landmarks. Therefore, ultrasound is an important adjunct for improving the success, efficiency, and safety of epidural block when used systematically by trained operators.[1-4]</w:t>
+        <w:t>Epidural block is a widely used neuraxial regional anesthetic technique for surgical anesthesia, perioperative analgesia, and labor analgesia. Nevertheless, the success of the conventional technique remains strongly influenced by accurate surface landmark identification, operator experience, and patient anatomical variation. In obese patients, in those with degenerative spinal changes, and in patients with difficult anatomy, landmark-based and loss-of-resistance techniques may increase needle passes, redirections, block failure, and complications. Neuraxial ultrasound provides assistance by identifying the vertebral interspace, midline, estimated epidural depth, and a more appropriate needle trajectory. This paper reviews neuraxial anatomy and the epidural space, the limitations of conventional epidural techniques, the basic principles and technical aspects of neuraxial ultrasound, ultrasound-guided epidural procedures, and its use in difficult-anatomy populations. Based on the reviewed sources, preprocedural ultrasound generally improves first-attempt success, reduces the number of attempts, and is most beneficial in predicted difficult procedures, particularly in obstetric patients and in patients with poorly palpable landmarks. Therefore, ultrasound is a valuable adjunct for improving the success, efficiency, and safety of epidural block.[1-4]</w:t>
       </w:r>
     </w:p>
     <w:p/>
@@ -239,7 +239,7 @@
           <w:i w:val="0"/>
           <w:sz w:val="24"/>
         </w:rPr>
-        <w:t>Blok epidural merupakan prosedur neuraksial yang penting dalam praktik anestesi karena dapat digunakan untuk anestesi pembedahan, analgesia pascabedah, dan analgesia persalinan. Walaupun teknik ini telah lama dipakai, keberhasilannya masih sangat bergantung pada kemampuan operator mengenali penanda anatomi permukaan tubuh dan menilai hilangnya resistensi saat ujung jarum memasuki ruang epidural. Pendekatan tersebut bersifat tidak langsung karena struktur sasaran tidak divisualisasikan secara langsung selama prosedur.[1,3,6]</w:t>
+        <w:t>Blok epidural merupakan salah satu teknik anestesi regional neuraksial yang memiliki peran penting dalam anestesi pembedahan, analgesia pascabedah, dan analgesia persalinan. Keberhasilan teknik ini secara klasik bertumpu pada palpasi penanda anatomi permukaan tubuh dan pengenalan hilangnya resistensi saat ujung jarum memasuki ruang epidural. Pendekatan tersebut bersifat tidak langsung karena operator tidak melihat struktur target secara langsung saat prosedur dilakukan.[3,6,7]</w:t>
       </w:r>
     </w:p>
     <w:p/>
@@ -254,7 +254,7 @@
           <w:i w:val="0"/>
           <w:sz w:val="24"/>
         </w:rPr>
-        <w:t>Pada pasien dengan obesitas, deformitas tulang belakang, perubahan degeneratif, atau penanda anatomi yang sukar diraba, teknik konvensional dapat menyebabkan salah identifikasi level pungsi, peningkatan jumlah tusukan, perubahan arah jarum berulang, dan kegagalan blok. Telaah sistematik menunjukkan bahwa ultrasonografi neuraksial membantu meningkatkan akurasi identifikasi level serta memperbaiki keberhasilan tindakan, terutama pada prosedur yang diperkirakan sulit.[1,2,4]</w:t>
+        <w:t>Pada praktik klinis, tindakan blok epidural dapat menjadi sulit pada pasien obesitas, pasien hamil, pasien dengan skoliosis, pasien dengan spondilitis ankilosa, pasien usia lanjut dengan perubahan degeneratif, dan pasien pascaoperasi tulang belakang. Keadaan tersebut dapat menyebabkan kesalahan identifikasi level pungsi, peningkatan jumlah tusukan, perubahan arah jarum berulang, dan meningkatnya risiko kegagalan blok maupun komplikasi.[1-4]</w:t>
       </w:r>
     </w:p>
     <w:p/>
@@ -269,7 +269,43 @@
           <w:i w:val="0"/>
           <w:sz w:val="24"/>
         </w:rPr>
-        <w:t>Ultrasonografi saat ini dipandang sebagai alat bantu yang bernilai karena dapat digunakan untuk mengenali garis tengah, menentukan celah intervertebra yang paling sesuai, memperkirakan kedalaman ruang epidural, dan merencanakan trajektori insersi jarum. Oleh sebab itu, pembahasan mengenai penggunaan ultrasonografi untuk meningkatkan keberhasilan tindakan blok epidural memiliki relevansi klinis yang tinggi.[2-5]</w:t>
+        <w:t xml:space="preserve">Perkembangan ultrasonografi neuraksial memberikan pendekatan yang lebih objektif dalam menilai anatomi tulang belakang sebelum tindakan. Ultrasonografi dapat membantu operator menentukan </w:t>
+      </w:r>
+      <w:r>
+        <w:rPr>
+          <w:rFonts w:ascii="Times New Roman" w:hAnsi="Times New Roman" w:eastAsia="Times New Roman"/>
+          <w:b w:val="0"/>
+          <w:i/>
+          <w:sz w:val="24"/>
+        </w:rPr>
+        <w:t>interspace</w:t>
+      </w:r>
+      <w:r>
+        <w:rPr>
+          <w:rFonts w:ascii="Times New Roman" w:hAnsi="Times New Roman" w:eastAsia="Times New Roman"/>
+          <w:b w:val="0"/>
+          <w:i w:val="0"/>
+          <w:sz w:val="24"/>
+        </w:rPr>
+        <w:t xml:space="preserve"> vertebra, garis tengah, </w:t>
+      </w:r>
+      <w:r>
+        <w:rPr>
+          <w:rFonts w:ascii="Times New Roman" w:hAnsi="Times New Roman" w:eastAsia="Times New Roman"/>
+          <w:b w:val="0"/>
+          <w:i/>
+          <w:sz w:val="24"/>
+        </w:rPr>
+        <w:t>line of symmetry</w:t>
+      </w:r>
+      <w:r>
+        <w:rPr>
+          <w:rFonts w:ascii="Times New Roman" w:hAnsi="Times New Roman" w:eastAsia="Times New Roman"/>
+          <w:b w:val="0"/>
+          <w:i w:val="0"/>
+          <w:sz w:val="24"/>
+        </w:rPr>
+        <w:t>, perkiraan kedalaman ruang epidural, serta arah insersi jarum yang paling sesuai. Oleh karena itu, penggunaan ultrasonografi berpotensi meningkatkan keberhasilan tindakan blok epidural dan menurunkan kesulitan teknis, terutama pada pasien dengan anatomi sulit.[1-5]</w:t>
       </w:r>
     </w:p>
     <w:p/>
@@ -299,7 +335,7 @@
           <w:i w:val="0"/>
           <w:sz w:val="24"/>
         </w:rPr>
-        <w:t>Referat ini bertujuan menjelaskan peran ultrasonografi dalam meningkatkan keberhasilan tindakan blok epidural melalui pembahasan anatomi neuraksial, keterbatasan teknik konvensional, prinsip dasar ultrasonografi neuraksial, teknik panduan ultrasonografi, serta penerapannya pada populasi dengan anatomi sulit.[1-6]</w:t>
+        <w:t>Referat ini bertujuan menjelaskan peran ultrasonografi dalam meningkatkan keberhasilan tindakan blok epidural melalui pembahasan anatomi neuraksial dan ruang epidural, keterbatasan teknik blok epidural konvensional, prinsip dasar dan teknis ultrasonografi neuraksial, prosedur panduan ultrasonografi, serta penerapannya pada populasi dengan anatomi sulit.[1-7]</w:t>
       </w:r>
     </w:p>
     <w:p/>
@@ -329,7 +365,7 @@
           <w:i w:val="0"/>
           <w:sz w:val="24"/>
         </w:rPr>
-        <w:t>Referat ini diharapkan menjadi bahan pembelajaran yang sistematis mengenai integrasi ultrasonografi pada blok epidural, membantu pengambilan keputusan klinis pada pasien dengan tindakan neuraksial sulit, dan menjadi acuan praktis untuk meningkatkan keberhasilan serta keselamatan prosedur.[1-4]</w:t>
+        <w:t>Referat ini diharapkan menjadi bahan pembelajaran yang sistematis mengenai integrasi ultrasonografi dalam tindakan blok epidural, membantu klinisi memahami keuntungan dan keterbatasan teknik tersebut, serta menjadi dasar peningkatan keselamatan dan keberhasilan prosedur neuraksial dalam praktik klinis sehari-hari.[1-4]</w:t>
       </w:r>
     </w:p>
     <w:p/>
@@ -389,7 +425,7 @@
           <w:i w:val="0"/>
           <w:sz w:val="24"/>
         </w:rPr>
-        <w:t>Vertebra torakal dan lumbal tersusun atas korpus vertebra di bagian anterior serta arkus vertebra di bagian posterior. Arkus vertebra dibentuk oleh pedikel dan lamina, lalu berlanjut menjadi prosesus spinosus, prosesus transversus, dan prosesus artikularis superior serta inferior. Pada regio torakal, prosesus spinosus cenderung lebih panjang dan miring ke kaudal, sedangkan pada regio lumbal prosesus spinosus lebih tebal dan lebih mendatar. Perbedaan ini memengaruhi jalur median atau paramedian dan sangat menentukan kualitas jendela akustik saat ultrasonografi tulang belakang dilakukan.[3,5,6]</w:t>
+        <w:t>Vertebra torakal dan lumbal terdiri atas korpus vertebra di bagian anterior dan arkus vertebra di bagian posterior. Arkus vertebra dibentuk oleh pedikel dan lamina, lalu berlanjut menjadi prosesus spinosus, prosesus transversus, serta prosesus artikularis superior dan inferior. Pada regio torakal, prosesus spinosus umumnya lebih panjang dan lebih miring ke arah kaudal, sedangkan pada regio lumbal prosesus spinosus lebih tebal dan cenderung lebih mendatar. Perbedaan anatomi ini memengaruhi akses median maupun paramedian serta memengaruhi terbentuknya jendela akustik saat ultrasonografi dilakukan.[3,5-7]</w:t>
       </w:r>
     </w:p>
     <w:p/>
@@ -404,7 +440,52 @@
           <w:i w:val="0"/>
           <w:sz w:val="24"/>
         </w:rPr>
-        <w:t>2. Ligamen neuraksial</w:t>
+        <w:t xml:space="preserve">2. Ligamen neuraksial: </w:t>
+      </w:r>
+      <w:r>
+        <w:rPr>
+          <w:rFonts w:ascii="Times New Roman" w:hAnsi="Times New Roman" w:eastAsia="Times New Roman"/>
+          <w:b/>
+          <w:i/>
+          <w:sz w:val="24"/>
+        </w:rPr>
+        <w:t>ligamentum supraspinosum</w:t>
+      </w:r>
+      <w:r>
+        <w:rPr>
+          <w:rFonts w:ascii="Times New Roman" w:hAnsi="Times New Roman" w:eastAsia="Times New Roman"/>
+          <w:b/>
+          <w:i w:val="0"/>
+          <w:sz w:val="24"/>
+        </w:rPr>
+        <w:t xml:space="preserve">, </w:t>
+      </w:r>
+      <w:r>
+        <w:rPr>
+          <w:rFonts w:ascii="Times New Roman" w:hAnsi="Times New Roman" w:eastAsia="Times New Roman"/>
+          <w:b/>
+          <w:i/>
+          <w:sz w:val="24"/>
+        </w:rPr>
+        <w:t>interspinosum</w:t>
+      </w:r>
+      <w:r>
+        <w:rPr>
+          <w:rFonts w:ascii="Times New Roman" w:hAnsi="Times New Roman" w:eastAsia="Times New Roman"/>
+          <w:b/>
+          <w:i w:val="0"/>
+          <w:sz w:val="24"/>
+        </w:rPr>
+        <w:t xml:space="preserve">, dan </w:t>
+      </w:r>
+      <w:r>
+        <w:rPr>
+          <w:rFonts w:ascii="Times New Roman" w:hAnsi="Times New Roman" w:eastAsia="Times New Roman"/>
+          <w:b/>
+          <w:i/>
+          <w:sz w:val="24"/>
+        </w:rPr>
+        <w:t>ligamentum flavum</w:t>
       </w:r>
     </w:p>
     <w:p/>
@@ -419,7 +500,7 @@
           <w:i w:val="0"/>
           <w:sz w:val="24"/>
         </w:rPr>
-        <w:t xml:space="preserve">Pada pendekatan median, jarum melewati ligamentum supraspinosum, ligamentum interspinosum, dan ligamentum flavum sebelum mencapai ruang epidural. Ligamentum supraspinosum berada di sepanjang puncak prosesus spinosus, ligamentum interspinosum terletak di antara prosesus spinosus, sedangkan ligamentum flavum menghubungkan lamina vertebra yang berdekatan. Dalam ultrasonografi neuraksial, area ligamentum flavum bersama duramater posterior dikenali sebagai </w:t>
+        <w:t xml:space="preserve">Pada pendekatan median, jarum akan melewati </w:t>
       </w:r>
       <w:r>
         <w:rPr>
@@ -428,7 +509,7 @@
           <w:i/>
           <w:sz w:val="24"/>
         </w:rPr>
-        <w:t>posterior complex</w:t>
+        <w:t>ligamentum supraspinosum</w:t>
       </w:r>
       <w:r>
         <w:rPr>
@@ -437,7 +518,133 @@
           <w:i w:val="0"/>
           <w:sz w:val="24"/>
         </w:rPr>
-        <w:t xml:space="preserve"> dan menjadi penanda penting untuk memperkirakan kedalaman target.[3,5,6]</w:t>
+        <w:t xml:space="preserve">, </w:t>
+      </w:r>
+      <w:r>
+        <w:rPr>
+          <w:rFonts w:ascii="Times New Roman" w:hAnsi="Times New Roman" w:eastAsia="Times New Roman"/>
+          <w:b w:val="0"/>
+          <w:i/>
+          <w:sz w:val="24"/>
+        </w:rPr>
+        <w:t>ligamentum interspinosum</w:t>
+      </w:r>
+      <w:r>
+        <w:rPr>
+          <w:rFonts w:ascii="Times New Roman" w:hAnsi="Times New Roman" w:eastAsia="Times New Roman"/>
+          <w:b w:val="0"/>
+          <w:i w:val="0"/>
+          <w:sz w:val="24"/>
+        </w:rPr>
+        <w:t xml:space="preserve">, dan </w:t>
+      </w:r>
+      <w:r>
+        <w:rPr>
+          <w:rFonts w:ascii="Times New Roman" w:hAnsi="Times New Roman" w:eastAsia="Times New Roman"/>
+          <w:b w:val="0"/>
+          <w:i/>
+          <w:sz w:val="24"/>
+        </w:rPr>
+        <w:t>ligamentum flavum</w:t>
+      </w:r>
+      <w:r>
+        <w:rPr>
+          <w:rFonts w:ascii="Times New Roman" w:hAnsi="Times New Roman" w:eastAsia="Times New Roman"/>
+          <w:b w:val="0"/>
+          <w:i w:val="0"/>
+          <w:sz w:val="24"/>
+        </w:rPr>
+        <w:t xml:space="preserve"> sebelum mencapai ruang epidural. </w:t>
+      </w:r>
+      <w:r>
+        <w:rPr>
+          <w:rFonts w:ascii="Times New Roman" w:hAnsi="Times New Roman" w:eastAsia="Times New Roman"/>
+          <w:b w:val="0"/>
+          <w:i/>
+          <w:sz w:val="24"/>
+        </w:rPr>
+        <w:t>Ligamentum supraspinosum</w:t>
+      </w:r>
+      <w:r>
+        <w:rPr>
+          <w:rFonts w:ascii="Times New Roman" w:hAnsi="Times New Roman" w:eastAsia="Times New Roman"/>
+          <w:b w:val="0"/>
+          <w:i w:val="0"/>
+          <w:sz w:val="24"/>
+        </w:rPr>
+        <w:t xml:space="preserve"> terletak di puncak prosesus spinosus, </w:t>
+      </w:r>
+      <w:r>
+        <w:rPr>
+          <w:rFonts w:ascii="Times New Roman" w:hAnsi="Times New Roman" w:eastAsia="Times New Roman"/>
+          <w:b w:val="0"/>
+          <w:i/>
+          <w:sz w:val="24"/>
+        </w:rPr>
+        <w:t>ligamentum interspinosum</w:t>
+      </w:r>
+      <w:r>
+        <w:rPr>
+          <w:rFonts w:ascii="Times New Roman" w:hAnsi="Times New Roman" w:eastAsia="Times New Roman"/>
+          <w:b w:val="0"/>
+          <w:i w:val="0"/>
+          <w:sz w:val="24"/>
+        </w:rPr>
+        <w:t xml:space="preserve"> berada di antara prosesus spinosus, sedangkan </w:t>
+      </w:r>
+      <w:r>
+        <w:rPr>
+          <w:rFonts w:ascii="Times New Roman" w:hAnsi="Times New Roman" w:eastAsia="Times New Roman"/>
+          <w:b w:val="0"/>
+          <w:i/>
+          <w:sz w:val="24"/>
+        </w:rPr>
+        <w:t>ligamentum flavum</w:t>
+      </w:r>
+      <w:r>
+        <w:rPr>
+          <w:rFonts w:ascii="Times New Roman" w:hAnsi="Times New Roman" w:eastAsia="Times New Roman"/>
+          <w:b w:val="0"/>
+          <w:i w:val="0"/>
+          <w:sz w:val="24"/>
+        </w:rPr>
+        <w:t xml:space="preserve"> menghubungkan lamina vertebra yang berdekatan. Pada ultrasonografi neuraksial, daerah </w:t>
+      </w:r>
+      <w:r>
+        <w:rPr>
+          <w:rFonts w:ascii="Times New Roman" w:hAnsi="Times New Roman" w:eastAsia="Times New Roman"/>
+          <w:b w:val="0"/>
+          <w:i/>
+          <w:sz w:val="24"/>
+        </w:rPr>
+        <w:t>ligamentum flavum</w:t>
+      </w:r>
+      <w:r>
+        <w:rPr>
+          <w:rFonts w:ascii="Times New Roman" w:hAnsi="Times New Roman" w:eastAsia="Times New Roman"/>
+          <w:b w:val="0"/>
+          <w:i w:val="0"/>
+          <w:sz w:val="24"/>
+        </w:rPr>
+        <w:t xml:space="preserve"> bersama duramater posterior sering dikenali sebagai </w:t>
+      </w:r>
+      <w:r>
+        <w:rPr>
+          <w:rFonts w:ascii="Times New Roman" w:hAnsi="Times New Roman" w:eastAsia="Times New Roman"/>
+          <w:b w:val="0"/>
+          <w:i/>
+          <w:sz w:val="24"/>
+        </w:rPr>
+        <w:t>posterior complex</w:t>
+      </w:r>
+      <w:r>
+        <w:rPr>
+          <w:rFonts w:ascii="Times New Roman" w:hAnsi="Times New Roman" w:eastAsia="Times New Roman"/>
+          <w:b w:val="0"/>
+          <w:i w:val="0"/>
+          <w:sz w:val="24"/>
+        </w:rPr>
+        <w:t xml:space="preserve"> yang penting untuk memperkirakan lokasi target tindakan.[3,5-7]</w:t>
       </w:r>
     </w:p>
     <w:p/>
@@ -452,7 +659,43 @@
           <w:i w:val="0"/>
           <w:sz w:val="24"/>
         </w:rPr>
-        <w:t>3. Ruang epidural</w:t>
+        <w:t xml:space="preserve">3. Ruang epidural: batas anatomi, isi, dan </w:t>
+      </w:r>
+      <w:r>
+        <w:rPr>
+          <w:rFonts w:ascii="Times New Roman" w:hAnsi="Times New Roman" w:eastAsia="Times New Roman"/>
+          <w:b/>
+          <w:i/>
+          <w:sz w:val="24"/>
+        </w:rPr>
+        <w:t>depth of epidural space</w:t>
+      </w:r>
+      <w:r>
+        <w:rPr>
+          <w:rFonts w:ascii="Times New Roman" w:hAnsi="Times New Roman" w:eastAsia="Times New Roman"/>
+          <w:b/>
+          <w:i w:val="0"/>
+          <w:sz w:val="24"/>
+        </w:rPr>
+        <w:t>/</w:t>
+      </w:r>
+      <w:r>
+        <w:rPr>
+          <w:rFonts w:ascii="Times New Roman" w:hAnsi="Times New Roman" w:eastAsia="Times New Roman"/>
+          <w:b/>
+          <w:i/>
+          <w:sz w:val="24"/>
+        </w:rPr>
+        <w:t>epidural depth estimation</w:t>
+      </w:r>
+      <w:r>
+        <w:rPr>
+          <w:rFonts w:ascii="Times New Roman" w:hAnsi="Times New Roman" w:eastAsia="Times New Roman"/>
+          <w:b/>
+          <w:i w:val="0"/>
+          <w:sz w:val="24"/>
+        </w:rPr>
+        <w:t xml:space="preserve"> (EDD)</w:t>
       </w:r>
     </w:p>
     <w:p/>
@@ -467,7 +710,61 @@
           <w:i w:val="0"/>
           <w:sz w:val="24"/>
         </w:rPr>
-        <w:t>Ruang epidural adalah ruang potensial di antara ligamentum flavum dan duramater. Batas anteriornya adalah ligamentum longitudinal posterior dan dinding anterior kanalis vertebralis, batas posteriornya adalah ligamentum flavum dan lamina, sedangkan batas lateralnya adalah pedikel dan foramen intervertebralis. Ruang ini berisi lemak epidural, pleksus vena epidural, jaringan ikat, dan akar saraf spinal. Bagi operator, estimasi kedalaman ruang epidural dari permukaan kulit sangat penting untuk mengurangi penetrasi berlebihan dan meminimalkan percobaan berulang.[2,3,5,6]</w:t>
+        <w:t xml:space="preserve">Ruang epidural adalah ruang potensial yang terletak di antara </w:t>
+      </w:r>
+      <w:r>
+        <w:rPr>
+          <w:rFonts w:ascii="Times New Roman" w:hAnsi="Times New Roman" w:eastAsia="Times New Roman"/>
+          <w:b w:val="0"/>
+          <w:i/>
+          <w:sz w:val="24"/>
+        </w:rPr>
+        <w:t>ligamentum flavum</w:t>
+      </w:r>
+      <w:r>
+        <w:rPr>
+          <w:rFonts w:ascii="Times New Roman" w:hAnsi="Times New Roman" w:eastAsia="Times New Roman"/>
+          <w:b w:val="0"/>
+          <w:i w:val="0"/>
+          <w:sz w:val="24"/>
+        </w:rPr>
+        <w:t xml:space="preserve"> dan duramater. Batas anteriornya adalah </w:t>
+      </w:r>
+      <w:r>
+        <w:rPr>
+          <w:rFonts w:ascii="Times New Roman" w:hAnsi="Times New Roman" w:eastAsia="Times New Roman"/>
+          <w:b w:val="0"/>
+          <w:i/>
+          <w:sz w:val="24"/>
+        </w:rPr>
+        <w:t>ligamentum longitudinale posterius</w:t>
+      </w:r>
+      <w:r>
+        <w:rPr>
+          <w:rFonts w:ascii="Times New Roman" w:hAnsi="Times New Roman" w:eastAsia="Times New Roman"/>
+          <w:b w:val="0"/>
+          <w:i w:val="0"/>
+          <w:sz w:val="24"/>
+        </w:rPr>
+        <w:t xml:space="preserve"> dan dinding anterior kanalis vertebralis, batas posteriornya adalah </w:t>
+      </w:r>
+      <w:r>
+        <w:rPr>
+          <w:rFonts w:ascii="Times New Roman" w:hAnsi="Times New Roman" w:eastAsia="Times New Roman"/>
+          <w:b w:val="0"/>
+          <w:i/>
+          <w:sz w:val="24"/>
+        </w:rPr>
+        <w:t>ligamentum flavum</w:t>
+      </w:r>
+      <w:r>
+        <w:rPr>
+          <w:rFonts w:ascii="Times New Roman" w:hAnsi="Times New Roman" w:eastAsia="Times New Roman"/>
+          <w:b w:val="0"/>
+          <w:i w:val="0"/>
+          <w:sz w:val="24"/>
+        </w:rPr>
+        <w:t xml:space="preserve"> dan lamina, sedangkan batas lateralnya adalah pedikel dan foramen intervertebralis. Ruang ini berisi lemak epidural, pleksus vena Batson, jaringan ikat, dan akar saraf spinal. Dalam praktik klinis, perkiraan jarak dari kulit ke ruang epidural atau EDD sangat penting karena membantu operator memperkirakan kedalaman target, mengurangi penetrasi berlebihan, dan menurunkan risiko penusukan berulang.[2,3,5-7]</w:t>
       </w:r>
     </w:p>
     <w:p/>
@@ -482,7 +779,7 @@
           <w:i w:val="0"/>
           <w:sz w:val="24"/>
         </w:rPr>
-        <w:t>4. Landmark permukaan tubuh konvensional dan akurasinya</w:t>
+        <w:t>4. Penanda anatomi permukaan tubuh konvensional dan akurasinya</w:t>
       </w:r>
     </w:p>
     <w:p/>
@@ -497,7 +794,7 @@
           <w:i w:val="0"/>
           <w:sz w:val="24"/>
         </w:rPr>
-        <w:t>Secara konvensional, operator menggunakan penanda anatomi permukaan tubuh seperti garis interkrista atau garis Tuffier untuk memperkirakan level lumbal. Akan tetapi, ketepatan penanda ini dapat menurun pada pasien obesitas, pasien hamil, atau pasien dengan anatomi tulang belakang yang berubah. Ultrasonografi membantu memperbaiki identifikasi level pungsi karena memberikan gambaran anatomi yang lebih objektif dibanding palpasi semata.[1-4]</w:t>
+        <w:t>Teknik konvensional umumnya menggunakan penanda anatomi permukaan tubuh seperti garis Tuffier atau garis interkrista untuk memperkirakan level lumbal. Akan tetapi, akurasi penanda anatomi tersebut dapat menurun pada pasien obesitas, pasien obstetri, dan pasien dengan perubahan anatomi tulang belakang. Beberapa telaah sistematik menunjukkan bahwa ultrasonografi memberikan identifikasi level yang lebih objektif dan lebih akurat dibanding palpasi semata.[1-4]</w:t>
       </w:r>
     </w:p>
     <w:p/>
@@ -560,7 +857,80 @@
           <w:i w:val="0"/>
           <w:sz w:val="24"/>
         </w:rPr>
-        <w:t>Teknik blok epidural konvensional umumnya dilakukan dengan memasukkan jarum Tuohy melalui jaringan lunak dan ligamen hingga mendekati ligamentum flavum, lalu menilai hilangnya resistensi dengan udara atau salin. Teknik ini tetap menjadi dasar praktik epidural, tetapi keberhasilannya bertumpu pada persepsi taktil operator dan tidak memberikan visualisasi langsung terhadap struktur sasaran.[3,6]</w:t>
+        <w:t xml:space="preserve">Teknik blok epidural konvensional dilakukan dengan memajukan jarum Tuohy melalui jaringan lunak dan ligamen hingga mendekati </w:t>
+      </w:r>
+      <w:r>
+        <w:rPr>
+          <w:rFonts w:ascii="Times New Roman" w:hAnsi="Times New Roman" w:eastAsia="Times New Roman"/>
+          <w:b w:val="0"/>
+          <w:i/>
+          <w:sz w:val="24"/>
+        </w:rPr>
+        <w:t>ligamentum flavum</w:t>
+      </w:r>
+      <w:r>
+        <w:rPr>
+          <w:rFonts w:ascii="Times New Roman" w:hAnsi="Times New Roman" w:eastAsia="Times New Roman"/>
+          <w:b w:val="0"/>
+          <w:i w:val="0"/>
+          <w:sz w:val="24"/>
+        </w:rPr>
+        <w:t>, kemudian menilai hilangnya resistensi menggunakan udara atau salin. Prinsip teknik ini adalah perubahan sensasi taktil yang dirasakan operator saat ujung jarum memasuki ruang epidural. Walaupun teknik ini masih menjadi dasar praktik blok epidural, teknik tersebut tidak memberikan visualisasi langsung terhadap struktur sasaran.[3,6,7]</w:t>
+      </w:r>
+    </w:p>
+    <w:p/>
+    <w:p>
+      <w:pPr>
+        <w:pStyle w:val="Heading3"/>
+      </w:pPr>
+      <w:r>
+        <w:rPr>
+          <w:rFonts w:ascii="Times New Roman" w:hAnsi="Times New Roman" w:eastAsia="Times New Roman"/>
+          <w:b/>
+          <w:i w:val="0"/>
+          <w:sz w:val="24"/>
+        </w:rPr>
+        <w:t xml:space="preserve">2. Faktor risiko kegagalan dan komplikasi teknik </w:t>
+      </w:r>
+      <w:r>
+        <w:rPr>
+          <w:rFonts w:ascii="Times New Roman" w:hAnsi="Times New Roman" w:eastAsia="Times New Roman"/>
+          <w:b/>
+          <w:i/>
+          <w:sz w:val="24"/>
+        </w:rPr>
+        <w:t>blind</w:t>
+      </w:r>
+    </w:p>
+    <w:p/>
+    <w:p>
+      <w:pPr/>
+      <w:r>
+        <w:rPr>
+          <w:rFonts w:ascii="Times New Roman" w:hAnsi="Times New Roman" w:eastAsia="Times New Roman"/>
+          <w:b/>
+          <w:i w:val="0"/>
+          <w:sz w:val="24"/>
+        </w:rPr>
+        <w:t xml:space="preserve">a. Identifikasi </w:t>
+      </w:r>
+      <w:r>
+        <w:rPr>
+          <w:rFonts w:ascii="Times New Roman" w:hAnsi="Times New Roman" w:eastAsia="Times New Roman"/>
+          <w:b/>
+          <w:i/>
+          <w:sz w:val="24"/>
+        </w:rPr>
+        <w:t>interspace</w:t>
+      </w:r>
+      <w:r>
+        <w:rPr>
+          <w:rFonts w:ascii="Times New Roman" w:hAnsi="Times New Roman" w:eastAsia="Times New Roman"/>
+          <w:b/>
+          <w:i w:val="0"/>
+          <w:sz w:val="24"/>
+        </w:rPr>
+        <w:t xml:space="preserve"> yang tidak akurat</w:t>
       </w:r>
     </w:p>
     <w:p/>
@@ -575,7 +945,7 @@
           <w:i w:val="0"/>
           <w:sz w:val="24"/>
         </w:rPr>
-        <w:t xml:space="preserve">Penggunaan udara ataupun salin pada teknik </w:t>
+        <w:t xml:space="preserve">Ketidaktepatan menentukan level </w:t>
       </w:r>
       <w:r>
         <w:rPr>
@@ -584,7 +954,7 @@
           <w:i/>
           <w:sz w:val="24"/>
         </w:rPr>
-        <w:t>loss of resistance</w:t>
+        <w:t>interspace</w:t>
       </w:r>
       <w:r>
         <w:rPr>
@@ -593,7 +963,114 @@
           <w:i w:val="0"/>
           <w:sz w:val="24"/>
         </w:rPr>
-        <w:t xml:space="preserve"> memiliki pertimbangan masing-masing, tetapi keduanya tidak mengatasi keterbatasan utama teknik konvensional, yaitu ketidakpastian level pungsi, arah jarum, dan kedalaman target sebelum insersi dilakukan.[3,6]</w:t>
+        <w:t xml:space="preserve"> dapat menyebabkan pungsi pada sela vertebra yang salah dan mengurangi keberhasilan tindakan. Masalah ini semakin nyata pada pasien dengan penanda anatomi yang tidak jelas.[1-4]</w:t>
+      </w:r>
+    </w:p>
+    <w:p/>
+    <w:p>
+      <w:pPr/>
+      <w:r>
+        <w:rPr>
+          <w:rFonts w:ascii="Times New Roman" w:hAnsi="Times New Roman" w:eastAsia="Times New Roman"/>
+          <w:b/>
+          <w:i w:val="0"/>
+          <w:sz w:val="24"/>
+        </w:rPr>
+        <w:t>b. Kesulitan insersi jarum pada anatomi abnormal atau sulit</w:t>
+      </w:r>
+    </w:p>
+    <w:p/>
+    <w:p>
+      <w:pPr>
+        <w:jc w:val="both"/>
+      </w:pPr>
+      <w:r>
+        <w:rPr>
+          <w:rFonts w:ascii="Times New Roman" w:hAnsi="Times New Roman" w:eastAsia="Times New Roman"/>
+          <w:b w:val="0"/>
+          <w:i w:val="0"/>
+          <w:sz w:val="24"/>
+        </w:rPr>
+        <w:t>Skoliosis, spondilitis ankilosa, perubahan degeneratif lansia, dan riwayat operasi tulang belakang dapat mengubah orientasi struktur tulang dan mempersempit ruang interlaminar. Kondisi tersebut menyebabkan jalur median konvensional menjadi lebih sukar dan meningkatkan kebutuhan perubahan arah jarum.[3,5,7]</w:t>
+      </w:r>
+    </w:p>
+    <w:p/>
+    <w:p>
+      <w:pPr/>
+      <w:r>
+        <w:rPr>
+          <w:rFonts w:ascii="Times New Roman" w:hAnsi="Times New Roman" w:eastAsia="Times New Roman"/>
+          <w:b/>
+          <w:i w:val="0"/>
+          <w:sz w:val="24"/>
+        </w:rPr>
+        <w:t>c. Penusukan berulang (</w:t>
+      </w:r>
+      <w:r>
+        <w:rPr>
+          <w:rFonts w:ascii="Times New Roman" w:hAnsi="Times New Roman" w:eastAsia="Times New Roman"/>
+          <w:b/>
+          <w:i/>
+          <w:sz w:val="24"/>
+        </w:rPr>
+        <w:t>multiple passes</w:t>
+      </w:r>
+      <w:r>
+        <w:rPr>
+          <w:rFonts w:ascii="Times New Roman" w:hAnsi="Times New Roman" w:eastAsia="Times New Roman"/>
+          <w:b/>
+          <w:i w:val="0"/>
+          <w:sz w:val="24"/>
+        </w:rPr>
+        <w:t>/</w:t>
+      </w:r>
+      <w:r>
+        <w:rPr>
+          <w:rFonts w:ascii="Times New Roman" w:hAnsi="Times New Roman" w:eastAsia="Times New Roman"/>
+          <w:b/>
+          <w:i/>
+          <w:sz w:val="24"/>
+        </w:rPr>
+        <w:t>attempts</w:t>
+      </w:r>
+      <w:r>
+        <w:rPr>
+          <w:rFonts w:ascii="Times New Roman" w:hAnsi="Times New Roman" w:eastAsia="Times New Roman"/>
+          <w:b/>
+          <w:i w:val="0"/>
+          <w:sz w:val="24"/>
+        </w:rPr>
+        <w:t>)</w:t>
+      </w:r>
+    </w:p>
+    <w:p/>
+    <w:p>
+      <w:pPr>
+        <w:jc w:val="both"/>
+      </w:pPr>
+      <w:r>
+        <w:rPr>
+          <w:rFonts w:ascii="Times New Roman" w:hAnsi="Times New Roman" w:eastAsia="Times New Roman"/>
+          <w:b w:val="0"/>
+          <w:i w:val="0"/>
+          <w:sz w:val="24"/>
+        </w:rPr>
+        <w:t>Semakin banyak jumlah tusukan dan perubahan arah jarum, semakin tinggi risiko nyeri prosedural, perdarahan, pungsi duramater yang tidak disengaja, dan blok yang tidak adekuat. Bukti telaah sistematik menunjukkan bahwa ultrasonografi membantu menurunkan jumlah percobaan, terutama pada prosedur yang diperkirakan sulit.[1,2,4]</w:t>
+      </w:r>
+    </w:p>
+    <w:p/>
+    <w:p>
+      <w:pPr>
+        <w:pStyle w:val="Heading2"/>
+      </w:pPr>
+      <w:r>
+        <w:rPr>
+          <w:rFonts w:ascii="Times New Roman" w:hAnsi="Times New Roman" w:eastAsia="Times New Roman"/>
+          <w:b/>
+          <w:i w:val="0"/>
+          <w:sz w:val="24"/>
+        </w:rPr>
+        <w:t>C. Prinsip Dasar dan Teknis USG Neuraksial</w:t>
       </w:r>
     </w:p>
     <w:p/>
@@ -608,7 +1085,38 @@
           <w:i w:val="0"/>
           <w:sz w:val="24"/>
         </w:rPr>
-        <w:t>2. Faktor risiko kegagalan dan komplikasi teknik konvensional</w:t>
+        <w:t>1. Pemilihan peralatan dan pengaturan alat</w:t>
+      </w:r>
+    </w:p>
+    <w:p/>
+    <w:p>
+      <w:pPr/>
+      <w:r>
+        <w:rPr>
+          <w:rFonts w:ascii="Times New Roman" w:hAnsi="Times New Roman" w:eastAsia="Times New Roman"/>
+          <w:b/>
+          <w:i w:val="0"/>
+          <w:sz w:val="24"/>
+        </w:rPr>
+        <w:t>a. Probe konveks/</w:t>
+      </w:r>
+      <w:r>
+        <w:rPr>
+          <w:rFonts w:ascii="Times New Roman" w:hAnsi="Times New Roman" w:eastAsia="Times New Roman"/>
+          <w:b/>
+          <w:i/>
+          <w:sz w:val="24"/>
+        </w:rPr>
+        <w:t>curved array</w:t>
+      </w:r>
+      <w:r>
+        <w:rPr>
+          <w:rFonts w:ascii="Times New Roman" w:hAnsi="Times New Roman" w:eastAsia="Times New Roman"/>
+          <w:b/>
+          <w:i w:val="0"/>
+          <w:sz w:val="24"/>
+        </w:rPr>
+        <w:t xml:space="preserve"> frekuensi rendah 2-5 MHz dibandingkan probe linier</w:t>
       </w:r>
     </w:p>
     <w:p/>
@@ -623,7 +1131,680 @@
           <w:i w:val="0"/>
           <w:sz w:val="24"/>
         </w:rPr>
-        <w:t>Faktor yang paling sering menyebabkan kesulitan tindakan ialah identifikasi interspace yang tidak akurat, anatomi tulang belakang yang sulit, serta meningkatnya jumlah tusukan dan perubahan arah jarum. Keadaan ini dapat memperpanjang waktu tindakan dan meningkatkan risiko blok tidak adekuat, pungsi duramater yang tidak disengaja, serta ketidaknyamanan pasien. Bukti dari telaah sistematik menunjukkan bahwa manfaat ultrasonografi paling nyata justru terlihat pada kelompok pasien dengan prosedur yang diperkirakan sulit.[1,2,4]</w:t>
+        <w:t xml:space="preserve">Pada pasien dewasa, ultrasonografi neuraksial umumnya menggunakan probe konveks atau transduser </w:t>
+      </w:r>
+      <w:r>
+        <w:rPr>
+          <w:rFonts w:ascii="Times New Roman" w:hAnsi="Times New Roman" w:eastAsia="Times New Roman"/>
+          <w:b w:val="0"/>
+          <w:i/>
+          <w:sz w:val="24"/>
+        </w:rPr>
+        <w:t>curved array</w:t>
+      </w:r>
+      <w:r>
+        <w:rPr>
+          <w:rFonts w:ascii="Times New Roman" w:hAnsi="Times New Roman" w:eastAsia="Times New Roman"/>
+          <w:b w:val="0"/>
+          <w:i w:val="0"/>
+          <w:sz w:val="24"/>
+        </w:rPr>
+        <w:t xml:space="preserve"> frekuensi rendah 2-5 MHz karena mampu menembus struktur yang lebih dalam. Probe linier dapat dipertimbangkan pada pasien yang sangat kurus atau pada populasi pediatrik ketika struktur sasaran lebih superfisial.[3,5]</w:t>
+      </w:r>
+    </w:p>
+    <w:p/>
+    <w:p>
+      <w:pPr/>
+      <w:r>
+        <w:rPr>
+          <w:rFonts w:ascii="Times New Roman" w:hAnsi="Times New Roman" w:eastAsia="Times New Roman"/>
+          <w:b/>
+          <w:i w:val="0"/>
+          <w:sz w:val="24"/>
+        </w:rPr>
+        <w:t xml:space="preserve">b. Pengaturan </w:t>
+      </w:r>
+      <w:r>
+        <w:rPr>
+          <w:rFonts w:ascii="Times New Roman" w:hAnsi="Times New Roman" w:eastAsia="Times New Roman"/>
+          <w:b/>
+          <w:i/>
+          <w:sz w:val="24"/>
+        </w:rPr>
+        <w:t>gain</w:t>
+      </w:r>
+      <w:r>
+        <w:rPr>
+          <w:rFonts w:ascii="Times New Roman" w:hAnsi="Times New Roman" w:eastAsia="Times New Roman"/>
+          <w:b/>
+          <w:i w:val="0"/>
+          <w:sz w:val="24"/>
+        </w:rPr>
+        <w:t xml:space="preserve">, </w:t>
+      </w:r>
+      <w:r>
+        <w:rPr>
+          <w:rFonts w:ascii="Times New Roman" w:hAnsi="Times New Roman" w:eastAsia="Times New Roman"/>
+          <w:b/>
+          <w:i/>
+          <w:sz w:val="24"/>
+        </w:rPr>
+        <w:t>depth</w:t>
+      </w:r>
+      <w:r>
+        <w:rPr>
+          <w:rFonts w:ascii="Times New Roman" w:hAnsi="Times New Roman" w:eastAsia="Times New Roman"/>
+          <w:b/>
+          <w:i w:val="0"/>
+          <w:sz w:val="24"/>
+        </w:rPr>
+        <w:t xml:space="preserve">, dan </w:t>
+      </w:r>
+      <w:r>
+        <w:rPr>
+          <w:rFonts w:ascii="Times New Roman" w:hAnsi="Times New Roman" w:eastAsia="Times New Roman"/>
+          <w:b/>
+          <w:i/>
+          <w:sz w:val="24"/>
+        </w:rPr>
+        <w:t>focus</w:t>
+      </w:r>
+    </w:p>
+    <w:p/>
+    <w:p>
+      <w:pPr>
+        <w:jc w:val="both"/>
+      </w:pPr>
+      <w:r>
+        <w:rPr>
+          <w:rFonts w:ascii="Times New Roman" w:hAnsi="Times New Roman" w:eastAsia="Times New Roman"/>
+          <w:b w:val="0"/>
+          <w:i w:val="0"/>
+          <w:sz w:val="24"/>
+        </w:rPr>
+        <w:t xml:space="preserve">Pengaturan </w:t>
+      </w:r>
+      <w:r>
+        <w:rPr>
+          <w:rFonts w:ascii="Times New Roman" w:hAnsi="Times New Roman" w:eastAsia="Times New Roman"/>
+          <w:b w:val="0"/>
+          <w:i/>
+          <w:sz w:val="24"/>
+        </w:rPr>
+        <w:t>gain</w:t>
+      </w:r>
+      <w:r>
+        <w:rPr>
+          <w:rFonts w:ascii="Times New Roman" w:hAnsi="Times New Roman" w:eastAsia="Times New Roman"/>
+          <w:b w:val="0"/>
+          <w:i w:val="0"/>
+          <w:sz w:val="24"/>
+        </w:rPr>
+        <w:t xml:space="preserve">, </w:t>
+      </w:r>
+      <w:r>
+        <w:rPr>
+          <w:rFonts w:ascii="Times New Roman" w:hAnsi="Times New Roman" w:eastAsia="Times New Roman"/>
+          <w:b w:val="0"/>
+          <w:i/>
+          <w:sz w:val="24"/>
+        </w:rPr>
+        <w:t>depth</w:t>
+      </w:r>
+      <w:r>
+        <w:rPr>
+          <w:rFonts w:ascii="Times New Roman" w:hAnsi="Times New Roman" w:eastAsia="Times New Roman"/>
+          <w:b w:val="0"/>
+          <w:i w:val="0"/>
+          <w:sz w:val="24"/>
+        </w:rPr>
+        <w:t xml:space="preserve">, dan </w:t>
+      </w:r>
+      <w:r>
+        <w:rPr>
+          <w:rFonts w:ascii="Times New Roman" w:hAnsi="Times New Roman" w:eastAsia="Times New Roman"/>
+          <w:b w:val="0"/>
+          <w:i/>
+          <w:sz w:val="24"/>
+        </w:rPr>
+        <w:t>focus</w:t>
+      </w:r>
+      <w:r>
+        <w:rPr>
+          <w:rFonts w:ascii="Times New Roman" w:hAnsi="Times New Roman" w:eastAsia="Times New Roman"/>
+          <w:b w:val="0"/>
+          <w:i w:val="0"/>
+          <w:sz w:val="24"/>
+        </w:rPr>
+        <w:t xml:space="preserve"> harus dioptimalkan agar struktur tulang belakang, </w:t>
+      </w:r>
+      <w:r>
+        <w:rPr>
+          <w:rFonts w:ascii="Times New Roman" w:hAnsi="Times New Roman" w:eastAsia="Times New Roman"/>
+          <w:b w:val="0"/>
+          <w:i/>
+          <w:sz w:val="24"/>
+        </w:rPr>
+        <w:t>posterior complex</w:t>
+      </w:r>
+      <w:r>
+        <w:rPr>
+          <w:rFonts w:ascii="Times New Roman" w:hAnsi="Times New Roman" w:eastAsia="Times New Roman"/>
+          <w:b w:val="0"/>
+          <w:i w:val="0"/>
+          <w:sz w:val="24"/>
+        </w:rPr>
+        <w:t xml:space="preserve">, dan </w:t>
+      </w:r>
+      <w:r>
+        <w:rPr>
+          <w:rFonts w:ascii="Times New Roman" w:hAnsi="Times New Roman" w:eastAsia="Times New Roman"/>
+          <w:b w:val="0"/>
+          <w:i/>
+          <w:sz w:val="24"/>
+        </w:rPr>
+        <w:t>anterior complex</w:t>
+      </w:r>
+      <w:r>
+        <w:rPr>
+          <w:rFonts w:ascii="Times New Roman" w:hAnsi="Times New Roman" w:eastAsia="Times New Roman"/>
+          <w:b w:val="0"/>
+          <w:i w:val="0"/>
+          <w:sz w:val="24"/>
+        </w:rPr>
+        <w:t xml:space="preserve"> dapat dikenali dengan baik. Kedalaman tampilan perlu disesuaikan dengan habitus pasien agar area target tidak terpotong dan tidak terlalu kecil.[3,5]</w:t>
+      </w:r>
+    </w:p>
+    <w:p/>
+    <w:p>
+      <w:pPr>
+        <w:pStyle w:val="Heading3"/>
+      </w:pPr>
+      <w:r>
+        <w:rPr>
+          <w:rFonts w:ascii="Times New Roman" w:hAnsi="Times New Roman" w:eastAsia="Times New Roman"/>
+          <w:b/>
+          <w:i w:val="0"/>
+          <w:sz w:val="24"/>
+        </w:rPr>
+        <w:t>2. Akustik tulang belakang dan fenomena sonografi</w:t>
+      </w:r>
+    </w:p>
+    <w:p/>
+    <w:p>
+      <w:pPr/>
+      <w:r>
+        <w:rPr>
+          <w:rFonts w:ascii="Times New Roman" w:hAnsi="Times New Roman" w:eastAsia="Times New Roman"/>
+          <w:b/>
+          <w:i w:val="0"/>
+          <w:sz w:val="24"/>
+        </w:rPr>
+        <w:t xml:space="preserve">a. </w:t>
+      </w:r>
+      <w:r>
+        <w:rPr>
+          <w:rFonts w:ascii="Times New Roman" w:hAnsi="Times New Roman" w:eastAsia="Times New Roman"/>
+          <w:b/>
+          <w:i/>
+          <w:sz w:val="24"/>
+        </w:rPr>
+        <w:t>Acoustic shadowing</w:t>
+      </w:r>
+      <w:r>
+        <w:rPr>
+          <w:rFonts w:ascii="Times New Roman" w:hAnsi="Times New Roman" w:eastAsia="Times New Roman"/>
+          <w:b/>
+          <w:i w:val="0"/>
+          <w:sz w:val="24"/>
+        </w:rPr>
+        <w:t xml:space="preserve"> dari struktur tulang</w:t>
+      </w:r>
+    </w:p>
+    <w:p/>
+    <w:p>
+      <w:pPr>
+        <w:jc w:val="both"/>
+      </w:pPr>
+      <w:r>
+        <w:rPr>
+          <w:rFonts w:ascii="Times New Roman" w:hAnsi="Times New Roman" w:eastAsia="Times New Roman"/>
+          <w:b w:val="0"/>
+          <w:i w:val="0"/>
+          <w:sz w:val="24"/>
+        </w:rPr>
+        <w:t>Prosesus spinosus dan lamina menghasilkan pantulan akustik tinggi dan bayangan akustik posterior. Bayangan ini merupakan alasan utama mengapa visualisasi struktur neuraksial tidak selalu mudah didapatkan pada semua bidang pindaian.[3,5]</w:t>
+      </w:r>
+    </w:p>
+    <w:p/>
+    <w:p>
+      <w:pPr/>
+      <w:r>
+        <w:rPr>
+          <w:rFonts w:ascii="Times New Roman" w:hAnsi="Times New Roman" w:eastAsia="Times New Roman"/>
+          <w:b/>
+          <w:i w:val="0"/>
+          <w:sz w:val="24"/>
+        </w:rPr>
+        <w:t xml:space="preserve">b. </w:t>
+      </w:r>
+      <w:r>
+        <w:rPr>
+          <w:rFonts w:ascii="Times New Roman" w:hAnsi="Times New Roman" w:eastAsia="Times New Roman"/>
+          <w:b/>
+          <w:i/>
+          <w:sz w:val="24"/>
+        </w:rPr>
+        <w:t>Acoustic window</w:t>
+      </w:r>
+      <w:r>
+        <w:rPr>
+          <w:rFonts w:ascii="Times New Roman" w:hAnsi="Times New Roman" w:eastAsia="Times New Roman"/>
+          <w:b/>
+          <w:i w:val="0"/>
+          <w:sz w:val="24"/>
+        </w:rPr>
+        <w:t xml:space="preserve"> pada ruang interspinal atau interlaminar</w:t>
+      </w:r>
+    </w:p>
+    <w:p/>
+    <w:p>
+      <w:pPr>
+        <w:jc w:val="both"/>
+      </w:pPr>
+      <w:r>
+        <w:rPr>
+          <w:rFonts w:ascii="Times New Roman" w:hAnsi="Times New Roman" w:eastAsia="Times New Roman"/>
+          <w:b w:val="0"/>
+          <w:i w:val="0"/>
+          <w:sz w:val="24"/>
+        </w:rPr>
+        <w:t xml:space="preserve">Ruang interspinal dan interlaminar membentuk </w:t>
+      </w:r>
+      <w:r>
+        <w:rPr>
+          <w:rFonts w:ascii="Times New Roman" w:hAnsi="Times New Roman" w:eastAsia="Times New Roman"/>
+          <w:b w:val="0"/>
+          <w:i/>
+          <w:sz w:val="24"/>
+        </w:rPr>
+        <w:t>acoustic window</w:t>
+      </w:r>
+      <w:r>
+        <w:rPr>
+          <w:rFonts w:ascii="Times New Roman" w:hAnsi="Times New Roman" w:eastAsia="Times New Roman"/>
+          <w:b w:val="0"/>
+          <w:i w:val="0"/>
+          <w:sz w:val="24"/>
+        </w:rPr>
+        <w:t xml:space="preserve"> yang memungkinkan operator menilai struktur di dalam kanalis vertebralis secara tidak langsung. Pemahaman terhadap jendela akustik ini sangat penting untuk keberhasilan pindaian neuraksial.[3,5]</w:t>
+      </w:r>
+    </w:p>
+    <w:p/>
+    <w:p>
+      <w:pPr>
+        <w:pStyle w:val="Heading3"/>
+      </w:pPr>
+      <w:r>
+        <w:rPr>
+          <w:rFonts w:ascii="Times New Roman" w:hAnsi="Times New Roman" w:eastAsia="Times New Roman"/>
+          <w:b/>
+          <w:i w:val="0"/>
+          <w:sz w:val="24"/>
+        </w:rPr>
+        <w:t>3. Bidang pindaian (</w:t>
+      </w:r>
+      <w:r>
+        <w:rPr>
+          <w:rFonts w:ascii="Times New Roman" w:hAnsi="Times New Roman" w:eastAsia="Times New Roman"/>
+          <w:b/>
+          <w:i/>
+          <w:sz w:val="24"/>
+        </w:rPr>
+        <w:t>scanning planes</w:t>
+      </w:r>
+      <w:r>
+        <w:rPr>
+          <w:rFonts w:ascii="Times New Roman" w:hAnsi="Times New Roman" w:eastAsia="Times New Roman"/>
+          <w:b/>
+          <w:i w:val="0"/>
+          <w:sz w:val="24"/>
+        </w:rPr>
+        <w:t>)</w:t>
+      </w:r>
+    </w:p>
+    <w:p/>
+    <w:p>
+      <w:pPr/>
+      <w:r>
+        <w:rPr>
+          <w:rFonts w:ascii="Times New Roman" w:hAnsi="Times New Roman" w:eastAsia="Times New Roman"/>
+          <w:b/>
+          <w:i w:val="0"/>
+          <w:sz w:val="24"/>
+        </w:rPr>
+        <w:t xml:space="preserve">a. </w:t>
+      </w:r>
+      <w:r>
+        <w:rPr>
+          <w:rFonts w:ascii="Times New Roman" w:hAnsi="Times New Roman" w:eastAsia="Times New Roman"/>
+          <w:b/>
+          <w:i/>
+          <w:sz w:val="24"/>
+        </w:rPr>
+        <w:t>Transverse interspinous view</w:t>
+      </w:r>
+      <w:r>
+        <w:rPr>
+          <w:rFonts w:ascii="Times New Roman" w:hAnsi="Times New Roman" w:eastAsia="Times New Roman"/>
+          <w:b/>
+          <w:i w:val="0"/>
+          <w:sz w:val="24"/>
+        </w:rPr>
+        <w:t>/</w:t>
+      </w:r>
+      <w:r>
+        <w:rPr>
+          <w:rFonts w:ascii="Times New Roman" w:hAnsi="Times New Roman" w:eastAsia="Times New Roman"/>
+          <w:b/>
+          <w:i/>
+          <w:sz w:val="24"/>
+        </w:rPr>
+        <w:t>transverse medial view</w:t>
+      </w:r>
+    </w:p>
+    <w:p/>
+    <w:p>
+      <w:pPr>
+        <w:jc w:val="both"/>
+      </w:pPr>
+      <w:r>
+        <w:rPr>
+          <w:rFonts w:ascii="Times New Roman" w:hAnsi="Times New Roman" w:eastAsia="Times New Roman"/>
+          <w:b w:val="0"/>
+          <w:i w:val="0"/>
+          <w:sz w:val="24"/>
+        </w:rPr>
+        <w:t xml:space="preserve">Bidang transversal membantu mengenali garis tengah, hubungan antarprosesus spinosus, serta perkiraan posisi </w:t>
+      </w:r>
+      <w:r>
+        <w:rPr>
+          <w:rFonts w:ascii="Times New Roman" w:hAnsi="Times New Roman" w:eastAsia="Times New Roman"/>
+          <w:b w:val="0"/>
+          <w:i/>
+          <w:sz w:val="24"/>
+        </w:rPr>
+        <w:t>posterior complex</w:t>
+      </w:r>
+      <w:r>
+        <w:rPr>
+          <w:rFonts w:ascii="Times New Roman" w:hAnsi="Times New Roman" w:eastAsia="Times New Roman"/>
+          <w:b w:val="0"/>
+          <w:i w:val="0"/>
+          <w:sz w:val="24"/>
+        </w:rPr>
+        <w:t xml:space="preserve"> dan </w:t>
+      </w:r>
+      <w:r>
+        <w:rPr>
+          <w:rFonts w:ascii="Times New Roman" w:hAnsi="Times New Roman" w:eastAsia="Times New Roman"/>
+          <w:b w:val="0"/>
+          <w:i/>
+          <w:sz w:val="24"/>
+        </w:rPr>
+        <w:t>anterior complex</w:t>
+      </w:r>
+      <w:r>
+        <w:rPr>
+          <w:rFonts w:ascii="Times New Roman" w:hAnsi="Times New Roman" w:eastAsia="Times New Roman"/>
+          <w:b w:val="0"/>
+          <w:i w:val="0"/>
+          <w:sz w:val="24"/>
+        </w:rPr>
+        <w:t>. Potongan ini juga berguna untuk memperkirakan kedalaman target dari permukaan kulit.[3,5]</w:t>
+      </w:r>
+    </w:p>
+    <w:p/>
+    <w:p>
+      <w:pPr/>
+      <w:r>
+        <w:rPr>
+          <w:rFonts w:ascii="Times New Roman" w:hAnsi="Times New Roman" w:eastAsia="Times New Roman"/>
+          <w:b/>
+          <w:i w:val="0"/>
+          <w:sz w:val="24"/>
+        </w:rPr>
+        <w:t xml:space="preserve">b. </w:t>
+      </w:r>
+      <w:r>
+        <w:rPr>
+          <w:rFonts w:ascii="Times New Roman" w:hAnsi="Times New Roman" w:eastAsia="Times New Roman"/>
+          <w:b/>
+          <w:i/>
+          <w:sz w:val="24"/>
+        </w:rPr>
+        <w:t>Paramedian sagittal view</w:t>
+      </w:r>
+      <w:r>
+        <w:rPr>
+          <w:rFonts w:ascii="Times New Roman" w:hAnsi="Times New Roman" w:eastAsia="Times New Roman"/>
+          <w:b/>
+          <w:i w:val="0"/>
+          <w:sz w:val="24"/>
+        </w:rPr>
+        <w:t>/</w:t>
+      </w:r>
+      <w:r>
+        <w:rPr>
+          <w:rFonts w:ascii="Times New Roman" w:hAnsi="Times New Roman" w:eastAsia="Times New Roman"/>
+          <w:b/>
+          <w:i/>
+          <w:sz w:val="24"/>
+        </w:rPr>
+        <w:t>paramedian sagittal oblique</w:t>
+      </w:r>
+      <w:r>
+        <w:rPr>
+          <w:rFonts w:ascii="Times New Roman" w:hAnsi="Times New Roman" w:eastAsia="Times New Roman"/>
+          <w:b/>
+          <w:i w:val="0"/>
+          <w:sz w:val="24"/>
+        </w:rPr>
+        <w:t xml:space="preserve"> (PSO) </w:t>
+      </w:r>
+      <w:r>
+        <w:rPr>
+          <w:rFonts w:ascii="Times New Roman" w:hAnsi="Times New Roman" w:eastAsia="Times New Roman"/>
+          <w:b/>
+          <w:i/>
+          <w:sz w:val="24"/>
+        </w:rPr>
+        <w:t>view</w:t>
+      </w:r>
+    </w:p>
+    <w:p/>
+    <w:p>
+      <w:pPr>
+        <w:jc w:val="both"/>
+      </w:pPr>
+      <w:r>
+        <w:rPr>
+          <w:rFonts w:ascii="Times New Roman" w:hAnsi="Times New Roman" w:eastAsia="Times New Roman"/>
+          <w:b w:val="0"/>
+          <w:i w:val="0"/>
+          <w:sz w:val="24"/>
+        </w:rPr>
+        <w:t xml:space="preserve">Potongan paramedian sagital oblik sangat penting karena menampilkan susunan lamina yang menyerupai pola </w:t>
+      </w:r>
+      <w:r>
+        <w:rPr>
+          <w:rFonts w:ascii="Times New Roman" w:hAnsi="Times New Roman" w:eastAsia="Times New Roman"/>
+          <w:b w:val="0"/>
+          <w:i/>
+          <w:sz w:val="24"/>
+        </w:rPr>
+        <w:t>sawtooth</w:t>
+      </w:r>
+      <w:r>
+        <w:rPr>
+          <w:rFonts w:ascii="Times New Roman" w:hAnsi="Times New Roman" w:eastAsia="Times New Roman"/>
+          <w:b w:val="0"/>
+          <w:i w:val="0"/>
+          <w:sz w:val="24"/>
+        </w:rPr>
+        <w:t>. Bidang ini membantu operator memilih sela interlaminar terbaik dan menilai arah trajektori jarum yang lebih sesuai, terutama pada anatomi yang sulit.[3,5]</w:t>
+      </w:r>
+    </w:p>
+    <w:p/>
+    <w:p>
+      <w:pPr>
+        <w:pStyle w:val="Heading3"/>
+      </w:pPr>
+      <w:r>
+        <w:rPr>
+          <w:rFonts w:ascii="Times New Roman" w:hAnsi="Times New Roman" w:eastAsia="Times New Roman"/>
+          <w:b/>
+          <w:i w:val="0"/>
+          <w:sz w:val="24"/>
+        </w:rPr>
+        <w:t>4. Gambaran sonografi ruang epidural</w:t>
+      </w:r>
+    </w:p>
+    <w:p/>
+    <w:p>
+      <w:pPr/>
+      <w:r>
+        <w:rPr>
+          <w:rFonts w:ascii="Times New Roman" w:hAnsi="Times New Roman" w:eastAsia="Times New Roman"/>
+          <w:b/>
+          <w:i w:val="0"/>
+          <w:sz w:val="24"/>
+        </w:rPr>
+        <w:t xml:space="preserve">a. Identifikasi </w:t>
+      </w:r>
+      <w:r>
+        <w:rPr>
+          <w:rFonts w:ascii="Times New Roman" w:hAnsi="Times New Roman" w:eastAsia="Times New Roman"/>
+          <w:b/>
+          <w:i/>
+          <w:sz w:val="24"/>
+        </w:rPr>
+        <w:t>ligamentum flavum-dura mater complex</w:t>
+      </w:r>
+      <w:r>
+        <w:rPr>
+          <w:rFonts w:ascii="Times New Roman" w:hAnsi="Times New Roman" w:eastAsia="Times New Roman"/>
+          <w:b/>
+          <w:i w:val="0"/>
+          <w:sz w:val="24"/>
+        </w:rPr>
+        <w:t xml:space="preserve"> dan kontur </w:t>
+      </w:r>
+      <w:r>
+        <w:rPr>
+          <w:rFonts w:ascii="Times New Roman" w:hAnsi="Times New Roman" w:eastAsia="Times New Roman"/>
+          <w:b/>
+          <w:i/>
+          <w:sz w:val="24"/>
+        </w:rPr>
+        <w:t>sawtooth</w:t>
+      </w:r>
+    </w:p>
+    <w:p/>
+    <w:p>
+      <w:pPr>
+        <w:jc w:val="both"/>
+      </w:pPr>
+      <w:r>
+        <w:rPr>
+          <w:rFonts w:ascii="Times New Roman" w:hAnsi="Times New Roman" w:eastAsia="Times New Roman"/>
+          <w:b w:val="0"/>
+          <w:i w:val="0"/>
+          <w:sz w:val="24"/>
+        </w:rPr>
+        <w:t xml:space="preserve">Pada potongan paramedian, susunan lamina membentuk pola </w:t>
+      </w:r>
+      <w:r>
+        <w:rPr>
+          <w:rFonts w:ascii="Times New Roman" w:hAnsi="Times New Roman" w:eastAsia="Times New Roman"/>
+          <w:b w:val="0"/>
+          <w:i/>
+          <w:sz w:val="24"/>
+        </w:rPr>
+        <w:t>sawtooth</w:t>
+      </w:r>
+      <w:r>
+        <w:rPr>
+          <w:rFonts w:ascii="Times New Roman" w:hAnsi="Times New Roman" w:eastAsia="Times New Roman"/>
+          <w:b w:val="0"/>
+          <w:i w:val="0"/>
+          <w:sz w:val="24"/>
+        </w:rPr>
+        <w:t xml:space="preserve"> atau pola gergaji. Di antara struktur tersebut, operator dapat mengenali </w:t>
+      </w:r>
+      <w:r>
+        <w:rPr>
+          <w:rFonts w:ascii="Times New Roman" w:hAnsi="Times New Roman" w:eastAsia="Times New Roman"/>
+          <w:b w:val="0"/>
+          <w:i/>
+          <w:sz w:val="24"/>
+        </w:rPr>
+        <w:t>ligamentum flavum-dura mater complex</w:t>
+      </w:r>
+      <w:r>
+        <w:rPr>
+          <w:rFonts w:ascii="Times New Roman" w:hAnsi="Times New Roman" w:eastAsia="Times New Roman"/>
+          <w:b w:val="0"/>
+          <w:i w:val="0"/>
+          <w:sz w:val="24"/>
+        </w:rPr>
+        <w:t xml:space="preserve"> sebagai salah satu penanda penting menuju ruang epidural.[3,5]</w:t>
+      </w:r>
+    </w:p>
+    <w:p/>
+    <w:p>
+      <w:pPr/>
+      <w:r>
+        <w:rPr>
+          <w:rFonts w:ascii="Times New Roman" w:hAnsi="Times New Roman" w:eastAsia="Times New Roman"/>
+          <w:b/>
+          <w:i w:val="0"/>
+          <w:sz w:val="24"/>
+        </w:rPr>
+        <w:t>b. Kompleks posterior dan kompleks anterior</w:t>
+      </w:r>
+    </w:p>
+    <w:p/>
+    <w:p>
+      <w:pPr>
+        <w:jc w:val="both"/>
+      </w:pPr>
+      <w:r>
+        <w:rPr>
+          <w:rFonts w:ascii="Times New Roman" w:hAnsi="Times New Roman" w:eastAsia="Times New Roman"/>
+          <w:b w:val="0"/>
+          <w:i w:val="0"/>
+          <w:sz w:val="24"/>
+        </w:rPr>
+        <w:t xml:space="preserve">Kompleks posterior terdiri atas </w:t>
+      </w:r>
+      <w:r>
+        <w:rPr>
+          <w:rFonts w:ascii="Times New Roman" w:hAnsi="Times New Roman" w:eastAsia="Times New Roman"/>
+          <w:b w:val="0"/>
+          <w:i/>
+          <w:sz w:val="24"/>
+        </w:rPr>
+        <w:t>ligamentum flavum</w:t>
+      </w:r>
+      <w:r>
+        <w:rPr>
+          <w:rFonts w:ascii="Times New Roman" w:hAnsi="Times New Roman" w:eastAsia="Times New Roman"/>
+          <w:b w:val="0"/>
+          <w:i w:val="0"/>
+          <w:sz w:val="24"/>
+        </w:rPr>
+        <w:t xml:space="preserve"> dan duramater posterior, sedangkan kompleks anterior mewakili struktur anterior kanalis vertebralis yang tampak pada pencitraan ultrasonografi neuraksial. Identifikasi kedua kompleks tersebut membantu operator memperkirakan kedalaman dan arah insersi jarum secara lebih tepat.[3,5]</w:t>
       </w:r>
     </w:p>
     <w:p/>
@@ -638,7 +1819,7 @@
           <w:i w:val="0"/>
           <w:sz w:val="24"/>
         </w:rPr>
-        <w:t>C. Prinsip Dasar dan Teknis Ultrasonografi Neuraksial</w:t>
+        <w:t>D. Prosedur Panduan USG pada Blok Epidural</w:t>
       </w:r>
     </w:p>
     <w:p/>
@@ -653,7 +1834,74 @@
           <w:i w:val="0"/>
           <w:sz w:val="24"/>
         </w:rPr>
-        <w:t>1. Pemilihan peralatan dan pengaturan alat</w:t>
+        <w:t>1. Pindaian pra-tindakan (</w:t>
+      </w:r>
+      <w:r>
+        <w:rPr>
+          <w:rFonts w:ascii="Times New Roman" w:hAnsi="Times New Roman" w:eastAsia="Times New Roman"/>
+          <w:b/>
+          <w:i/>
+          <w:sz w:val="24"/>
+        </w:rPr>
+        <w:t>pre-procedure ultrasound scan</w:t>
+      </w:r>
+      <w:r>
+        <w:rPr>
+          <w:rFonts w:ascii="Times New Roman" w:hAnsi="Times New Roman" w:eastAsia="Times New Roman"/>
+          <w:b/>
+          <w:i w:val="0"/>
+          <w:sz w:val="24"/>
+        </w:rPr>
+        <w:t>/</w:t>
+      </w:r>
+      <w:r>
+        <w:rPr>
+          <w:rFonts w:ascii="Times New Roman" w:hAnsi="Times New Roman" w:eastAsia="Times New Roman"/>
+          <w:b/>
+          <w:i/>
+          <w:sz w:val="24"/>
+        </w:rPr>
+        <w:t>teknik statis</w:t>
+      </w:r>
+      <w:r>
+        <w:rPr>
+          <w:rFonts w:ascii="Times New Roman" w:hAnsi="Times New Roman" w:eastAsia="Times New Roman"/>
+          <w:b/>
+          <w:i w:val="0"/>
+          <w:sz w:val="24"/>
+        </w:rPr>
+        <w:t>)</w:t>
+      </w:r>
+    </w:p>
+    <w:p/>
+    <w:p>
+      <w:pPr/>
+      <w:r>
+        <w:rPr>
+          <w:rFonts w:ascii="Times New Roman" w:hAnsi="Times New Roman" w:eastAsia="Times New Roman"/>
+          <w:b/>
+          <w:i w:val="0"/>
+          <w:sz w:val="24"/>
+        </w:rPr>
+        <w:t xml:space="preserve">a. Penentuan tingkat </w:t>
+      </w:r>
+      <w:r>
+        <w:rPr>
+          <w:rFonts w:ascii="Times New Roman" w:hAnsi="Times New Roman" w:eastAsia="Times New Roman"/>
+          <w:b/>
+          <w:i/>
+          <w:sz w:val="24"/>
+        </w:rPr>
+        <w:t>interspace</w:t>
+      </w:r>
+      <w:r>
+        <w:rPr>
+          <w:rFonts w:ascii="Times New Roman" w:hAnsi="Times New Roman" w:eastAsia="Times New Roman"/>
+          <w:b/>
+          <w:i w:val="0"/>
+          <w:sz w:val="24"/>
+        </w:rPr>
+        <w:t xml:space="preserve"> vertebra secara tepat</w:t>
       </w:r>
     </w:p>
     <w:p/>
@@ -668,7 +1916,71 @@
           <w:i w:val="0"/>
           <w:sz w:val="24"/>
         </w:rPr>
-        <w:t xml:space="preserve">Pada pasien dewasa, ultrasonografi neuraksial umumnya menggunakan transduser konveks frekuensi rendah 2-5 MHz atau transduser </w:t>
+        <w:t>Pada pindaian pra-tindakan, operator mengenali sakrum dan sela L5-S1, lalu menghitung interspace ke arah kranial untuk menentukan level pungsi yang tepat. Langkah ini penting untuk mengurangi kesalahan level pungsi.[2,3,5]</w:t>
+      </w:r>
+    </w:p>
+    <w:p/>
+    <w:p>
+      <w:pPr/>
+      <w:r>
+        <w:rPr>
+          <w:rFonts w:ascii="Times New Roman" w:hAnsi="Times New Roman" w:eastAsia="Times New Roman"/>
+          <w:b/>
+          <w:i w:val="0"/>
+          <w:sz w:val="24"/>
+        </w:rPr>
+        <w:t xml:space="preserve">b. Penentuan </w:t>
+      </w:r>
+      <w:r>
+        <w:rPr>
+          <w:rFonts w:ascii="Times New Roman" w:hAnsi="Times New Roman" w:eastAsia="Times New Roman"/>
+          <w:b/>
+          <w:i/>
+          <w:sz w:val="24"/>
+        </w:rPr>
+        <w:t>line of symmetry</w:t>
+      </w:r>
+      <w:r>
+        <w:rPr>
+          <w:rFonts w:ascii="Times New Roman" w:hAnsi="Times New Roman" w:eastAsia="Times New Roman"/>
+          <w:b/>
+          <w:i w:val="0"/>
+          <w:sz w:val="24"/>
+        </w:rPr>
+        <w:t xml:space="preserve"> dan titik masuk jarum (</w:t>
+      </w:r>
+      <w:r>
+        <w:rPr>
+          <w:rFonts w:ascii="Times New Roman" w:hAnsi="Times New Roman" w:eastAsia="Times New Roman"/>
+          <w:b/>
+          <w:i/>
+          <w:sz w:val="24"/>
+        </w:rPr>
+        <w:t>puncture point</w:t>
+      </w:r>
+      <w:r>
+        <w:rPr>
+          <w:rFonts w:ascii="Times New Roman" w:hAnsi="Times New Roman" w:eastAsia="Times New Roman"/>
+          <w:b/>
+          <w:i w:val="0"/>
+          <w:sz w:val="24"/>
+        </w:rPr>
+        <w:t>)</w:t>
+      </w:r>
+    </w:p>
+    <w:p/>
+    <w:p>
+      <w:pPr>
+        <w:jc w:val="both"/>
+      </w:pPr>
+      <w:r>
+        <w:rPr>
+          <w:rFonts w:ascii="Times New Roman" w:hAnsi="Times New Roman" w:eastAsia="Times New Roman"/>
+          <w:b w:val="0"/>
+          <w:i w:val="0"/>
+          <w:sz w:val="24"/>
+        </w:rPr>
+        <w:t xml:space="preserve">Setelah interspace yang tepat ditemukan, operator menentukan garis tengah atau </w:t>
       </w:r>
       <w:r>
         <w:rPr>
@@ -677,7 +1989,7 @@
           <w:i/>
           <w:sz w:val="24"/>
         </w:rPr>
-        <w:t>curved array</w:t>
+        <w:t>line of symmetry</w:t>
       </w:r>
       <w:r>
         <w:rPr>
@@ -686,17 +1998,45 @@
           <w:i w:val="0"/>
           <w:sz w:val="24"/>
         </w:rPr>
-        <w:t xml:space="preserve"> karena daya tembusnya lebih baik untuk struktur yang dalam. Pada pasien yang lebih kurus atau pada struktur yang lebih superfisial, transduser linier dapat dipertimbangkan. Pengaturan </w:t>
-      </w:r>
-      <w:r>
-        <w:rPr>
-          <w:rFonts w:ascii="Times New Roman" w:hAnsi="Times New Roman" w:eastAsia="Times New Roman"/>
-          <w:b w:val="0"/>
+        <w:t xml:space="preserve"> dan menandai titik masuk jarum pada kulit. Tahap ini membantu menyederhanakan prosedur saat insersi jarum dilakukan.[2,3,5]</w:t>
+      </w:r>
+    </w:p>
+    <w:p/>
+    <w:p>
+      <w:pPr/>
+      <w:r>
+        <w:rPr>
+          <w:rFonts w:ascii="Times New Roman" w:hAnsi="Times New Roman" w:eastAsia="Times New Roman"/>
+          <w:b/>
+          <w:i w:val="0"/>
+          <w:sz w:val="24"/>
+        </w:rPr>
+        <w:t>c. Pengukuran jarak dari kulit ke ruang epidural (</w:t>
+      </w:r>
+      <w:r>
+        <w:rPr>
+          <w:rFonts w:ascii="Times New Roman" w:hAnsi="Times New Roman" w:eastAsia="Times New Roman"/>
+          <w:b/>
           <w:i/>
           <w:sz w:val="24"/>
         </w:rPr>
-        <w:t>gain</w:t>
-      </w:r>
+        <w:t>epidural depth estimation</w:t>
+      </w:r>
+      <w:r>
+        <w:rPr>
+          <w:rFonts w:ascii="Times New Roman" w:hAnsi="Times New Roman" w:eastAsia="Times New Roman"/>
+          <w:b/>
+          <w:i w:val="0"/>
+          <w:sz w:val="24"/>
+        </w:rPr>
+        <w:t>)</w:t>
+      </w:r>
+    </w:p>
+    <w:p/>
+    <w:p>
+      <w:pPr>
+        <w:jc w:val="both"/>
+      </w:pPr>
       <w:r>
         <w:rPr>
           <w:rFonts w:ascii="Times New Roman" w:hAnsi="Times New Roman" w:eastAsia="Times New Roman"/>
@@ -704,17 +2044,27 @@
           <w:i w:val="0"/>
           <w:sz w:val="24"/>
         </w:rPr>
-        <w:t xml:space="preserve">, </w:t>
-      </w:r>
-      <w:r>
-        <w:rPr>
-          <w:rFonts w:ascii="Times New Roman" w:hAnsi="Times New Roman" w:eastAsia="Times New Roman"/>
-          <w:b w:val="0"/>
-          <w:i/>
-          <w:sz w:val="24"/>
-        </w:rPr>
-        <w:t>depth</w:t>
-      </w:r>
+        <w:t>Ultrasonografi memungkinkan pengukuran kedalaman target dari kulit ke ruang epidural. Informasi ini membantu operator mengantisipasi kapan ujung jarum diperkirakan mencapai target dan mengurangi risiko penetrasi terlalu dalam.[2,3]</w:t>
+      </w:r>
+    </w:p>
+    <w:p/>
+    <w:p>
+      <w:pPr/>
+      <w:r>
+        <w:rPr>
+          <w:rFonts w:ascii="Times New Roman" w:hAnsi="Times New Roman" w:eastAsia="Times New Roman"/>
+          <w:b/>
+          <w:i w:val="0"/>
+          <w:sz w:val="24"/>
+        </w:rPr>
+        <w:t>d. Penentuan sudut atau trajektori insersi jarum yang optimal</w:t>
+      </w:r>
+    </w:p>
+    <w:p/>
+    <w:p>
+      <w:pPr>
+        <w:jc w:val="both"/>
+      </w:pPr>
       <w:r>
         <w:rPr>
           <w:rFonts w:ascii="Times New Roman" w:hAnsi="Times New Roman" w:eastAsia="Times New Roman"/>
@@ -722,43 +2072,7 @@
           <w:i w:val="0"/>
           <w:sz w:val="24"/>
         </w:rPr>
-        <w:t xml:space="preserve">, dan </w:t>
-      </w:r>
-      <w:r>
-        <w:rPr>
-          <w:rFonts w:ascii="Times New Roman" w:hAnsi="Times New Roman" w:eastAsia="Times New Roman"/>
-          <w:b w:val="0"/>
-          <w:i/>
-          <w:sz w:val="24"/>
-        </w:rPr>
-        <w:t>focus</w:t>
-      </w:r>
-      <w:r>
-        <w:rPr>
-          <w:rFonts w:ascii="Times New Roman" w:hAnsi="Times New Roman" w:eastAsia="Times New Roman"/>
-          <w:b w:val="0"/>
-          <w:i w:val="0"/>
-          <w:sz w:val="24"/>
-        </w:rPr>
-        <w:t xml:space="preserve"> harus disesuaikan agar </w:t>
-      </w:r>
-      <w:r>
-        <w:rPr>
-          <w:rFonts w:ascii="Times New Roman" w:hAnsi="Times New Roman" w:eastAsia="Times New Roman"/>
-          <w:b w:val="0"/>
-          <w:i/>
-          <w:sz w:val="24"/>
-        </w:rPr>
-        <w:t>posterior complex</w:t>
-      </w:r>
-      <w:r>
-        <w:rPr>
-          <w:rFonts w:ascii="Times New Roman" w:hAnsi="Times New Roman" w:eastAsia="Times New Roman"/>
-          <w:b w:val="0"/>
-          <w:i w:val="0"/>
-          <w:sz w:val="24"/>
-        </w:rPr>
-        <w:t xml:space="preserve"> dan struktur yang lebih dalam tampak jelas pada layar.[3,5]</w:t>
+        <w:t>Selain menentukan kedalaman, ultrasonografi juga membantu operator memperkirakan arah kraniokaudal dan mediolateral yang paling sesuai. Dengan demikian, kebutuhan perubahan arah jarum dapat dikurangi.[1-3]</w:t>
       </w:r>
     </w:p>
     <w:p/>
@@ -773,7 +2087,83 @@
           <w:i w:val="0"/>
           <w:sz w:val="24"/>
         </w:rPr>
-        <w:t>2. Akustik tulang belakang dan fenomena sonografi</w:t>
+        <w:t xml:space="preserve">2. Panduan USG </w:t>
+      </w:r>
+      <w:r>
+        <w:rPr>
+          <w:rFonts w:ascii="Times New Roman" w:hAnsi="Times New Roman" w:eastAsia="Times New Roman"/>
+          <w:b/>
+          <w:i/>
+          <w:sz w:val="24"/>
+        </w:rPr>
+        <w:t>real-time</w:t>
+      </w:r>
+      <w:r>
+        <w:rPr>
+          <w:rFonts w:ascii="Times New Roman" w:hAnsi="Times New Roman" w:eastAsia="Times New Roman"/>
+          <w:b/>
+          <w:i w:val="0"/>
+          <w:sz w:val="24"/>
+        </w:rPr>
+        <w:t xml:space="preserve"> (</w:t>
+      </w:r>
+      <w:r>
+        <w:rPr>
+          <w:rFonts w:ascii="Times New Roman" w:hAnsi="Times New Roman" w:eastAsia="Times New Roman"/>
+          <w:b/>
+          <w:i/>
+          <w:sz w:val="24"/>
+        </w:rPr>
+        <w:t>dynamic ultrasound</w:t>
+      </w:r>
+      <w:r>
+        <w:rPr>
+          <w:rFonts w:ascii="Times New Roman" w:hAnsi="Times New Roman" w:eastAsia="Times New Roman"/>
+          <w:b/>
+          <w:i w:val="0"/>
+          <w:sz w:val="24"/>
+        </w:rPr>
+        <w:t>)</w:t>
+      </w:r>
+    </w:p>
+    <w:p/>
+    <w:p>
+      <w:pPr/>
+      <w:r>
+        <w:rPr>
+          <w:rFonts w:ascii="Times New Roman" w:hAnsi="Times New Roman" w:eastAsia="Times New Roman"/>
+          <w:b/>
+          <w:i w:val="0"/>
+          <w:sz w:val="24"/>
+        </w:rPr>
+        <w:t xml:space="preserve">a. Teknik </w:t>
+      </w:r>
+      <w:r>
+        <w:rPr>
+          <w:rFonts w:ascii="Times New Roman" w:hAnsi="Times New Roman" w:eastAsia="Times New Roman"/>
+          <w:b/>
+          <w:i/>
+          <w:sz w:val="24"/>
+        </w:rPr>
+        <w:t>in-plane</w:t>
+      </w:r>
+      <w:r>
+        <w:rPr>
+          <w:rFonts w:ascii="Times New Roman" w:hAnsi="Times New Roman" w:eastAsia="Times New Roman"/>
+          <w:b/>
+          <w:i w:val="0"/>
+          <w:sz w:val="24"/>
+        </w:rPr>
+        <w:t xml:space="preserve"> dibandingkan </w:t>
+      </w:r>
+      <w:r>
+        <w:rPr>
+          <w:rFonts w:ascii="Times New Roman" w:hAnsi="Times New Roman" w:eastAsia="Times New Roman"/>
+          <w:b/>
+          <w:i/>
+          <w:sz w:val="24"/>
+        </w:rPr>
+        <w:t>out-of-plane</w:t>
       </w:r>
     </w:p>
     <w:p/>
@@ -788,7 +2178,131 @@
           <w:i w:val="0"/>
           <w:sz w:val="24"/>
         </w:rPr>
-        <w:t>Tulang menghasilkan pantulan akustik tinggi dengan bayangan akustik di bawahnya. Oleh karena itu, prosesus spinosus dan lamina tampak hiperekoik dengan bayangan posterior gelap. Sebaliknya, ruang interspinosus atau interlaminar menjadi jendela akustik yang memungkinkan operator menilai struktur neuraksial secara tidak langsung. Pemahaman tentang hubungan antara tulang, bayangan akustik, dan jendela akustik merupakan dasar interpretasi citra ultrasonografi neuraksial.[3,5]</w:t>
+        <w:t xml:space="preserve">Pada teknik </w:t>
+      </w:r>
+      <w:r>
+        <w:rPr>
+          <w:rFonts w:ascii="Times New Roman" w:hAnsi="Times New Roman" w:eastAsia="Times New Roman"/>
+          <w:b w:val="0"/>
+          <w:i/>
+          <w:sz w:val="24"/>
+        </w:rPr>
+        <w:t>in-plane</w:t>
+      </w:r>
+      <w:r>
+        <w:rPr>
+          <w:rFonts w:ascii="Times New Roman" w:hAnsi="Times New Roman" w:eastAsia="Times New Roman"/>
+          <w:b w:val="0"/>
+          <w:i w:val="0"/>
+          <w:sz w:val="24"/>
+        </w:rPr>
+        <w:t xml:space="preserve">, jarum diupayakan berada sejajar dengan bidang ultrasonografi sehingga batang dan ujung jarum lebih mudah diikuti. Pada teknik </w:t>
+      </w:r>
+      <w:r>
+        <w:rPr>
+          <w:rFonts w:ascii="Times New Roman" w:hAnsi="Times New Roman" w:eastAsia="Times New Roman"/>
+          <w:b w:val="0"/>
+          <w:i/>
+          <w:sz w:val="24"/>
+        </w:rPr>
+        <w:t>out-of-plane</w:t>
+      </w:r>
+      <w:r>
+        <w:rPr>
+          <w:rFonts w:ascii="Times New Roman" w:hAnsi="Times New Roman" w:eastAsia="Times New Roman"/>
+          <w:b w:val="0"/>
+          <w:i w:val="0"/>
+          <w:sz w:val="24"/>
+        </w:rPr>
+        <w:t>, jarum memotong bidang ultrasonografi dan biasanya tampak sebagai titik hiperekoik. Kedua teknik ini dapat digunakan, tetapi masing-masing memiliki tantangan teknis tersendiri.[3,5]</w:t>
+      </w:r>
+    </w:p>
+    <w:p/>
+    <w:p>
+      <w:pPr/>
+      <w:r>
+        <w:rPr>
+          <w:rFonts w:ascii="Times New Roman" w:hAnsi="Times New Roman" w:eastAsia="Times New Roman"/>
+          <w:b/>
+          <w:i w:val="0"/>
+          <w:sz w:val="24"/>
+        </w:rPr>
+        <w:t xml:space="preserve">b. Tantangan, keterbatasan, dan indikasi khusus teknik </w:t>
+      </w:r>
+      <w:r>
+        <w:rPr>
+          <w:rFonts w:ascii="Times New Roman" w:hAnsi="Times New Roman" w:eastAsia="Times New Roman"/>
+          <w:b/>
+          <w:i/>
+          <w:sz w:val="24"/>
+        </w:rPr>
+        <w:t>real-time</w:t>
+      </w:r>
+    </w:p>
+    <w:p/>
+    <w:p>
+      <w:pPr>
+        <w:jc w:val="both"/>
+      </w:pPr>
+      <w:r>
+        <w:rPr>
+          <w:rFonts w:ascii="Times New Roman" w:hAnsi="Times New Roman" w:eastAsia="Times New Roman"/>
+          <w:b w:val="0"/>
+          <w:i w:val="0"/>
+          <w:sz w:val="24"/>
+        </w:rPr>
+        <w:t xml:space="preserve">Panduan </w:t>
+      </w:r>
+      <w:r>
+        <w:rPr>
+          <w:rFonts w:ascii="Times New Roman" w:hAnsi="Times New Roman" w:eastAsia="Times New Roman"/>
+          <w:b w:val="0"/>
+          <w:i/>
+          <w:sz w:val="24"/>
+        </w:rPr>
+        <w:t>real-time</w:t>
+      </w:r>
+      <w:r>
+        <w:rPr>
+          <w:rFonts w:ascii="Times New Roman" w:hAnsi="Times New Roman" w:eastAsia="Times New Roman"/>
+          <w:b w:val="0"/>
+          <w:i w:val="0"/>
+          <w:sz w:val="24"/>
+        </w:rPr>
+        <w:t xml:space="preserve"> memerlukan koordinasi tangan-mata yang baik, pengalaman operator, dan jendela akustik yang memadai. Hambatan dari struktur tulang dan sulitnya mempertahankan visualisasi ujung jarum membuat teknik ini lebih kompleks dibanding pindaian pra-tindakan. Oleh sebab itu, teknik </w:t>
+      </w:r>
+      <w:r>
+        <w:rPr>
+          <w:rFonts w:ascii="Times New Roman" w:hAnsi="Times New Roman" w:eastAsia="Times New Roman"/>
+          <w:b w:val="0"/>
+          <w:i/>
+          <w:sz w:val="24"/>
+        </w:rPr>
+        <w:t>real-time</w:t>
+      </w:r>
+      <w:r>
+        <w:rPr>
+          <w:rFonts w:ascii="Times New Roman" w:hAnsi="Times New Roman" w:eastAsia="Times New Roman"/>
+          <w:b w:val="0"/>
+          <w:i w:val="0"/>
+          <w:sz w:val="24"/>
+        </w:rPr>
+        <w:t xml:space="preserve"> lebih tepat dipakai pada operator berpengalaman atau pada kasus terpilih.[3,5]</w:t>
+      </w:r>
+    </w:p>
+    <w:p/>
+    <w:p>
+      <w:pPr>
+        <w:pStyle w:val="Heading2"/>
+      </w:pPr>
+      <w:r>
+        <w:rPr>
+          <w:rFonts w:ascii="Times New Roman" w:hAnsi="Times New Roman" w:eastAsia="Times New Roman"/>
+          <w:b/>
+          <w:i w:val="0"/>
+          <w:sz w:val="24"/>
+        </w:rPr>
+        <w:t>E. Penggunaan USG pada Populasi Anatomi Sulit</w:t>
       </w:r>
     </w:p>
     <w:p/>
@@ -803,7 +2317,7 @@
           <w:i w:val="0"/>
           <w:sz w:val="24"/>
         </w:rPr>
-        <w:t>3. Bidang pindaian</w:t>
+        <w:t>1. Pasien obesitas</w:t>
       </w:r>
     </w:p>
     <w:p/>
@@ -818,7 +2332,7 @@
           <w:i w:val="0"/>
           <w:sz w:val="24"/>
         </w:rPr>
-        <w:t xml:space="preserve">Bidang pindaian yang paling penting ialah </w:t>
+        <w:t xml:space="preserve">Pada pasien obesitas dengan indeks massa tubuh tinggi, penanda anatomi tulang sering kali tidak teraba jelas. Ultrasonografi membantu menentukan garis tengah, memilih </w:t>
       </w:r>
       <w:r>
         <w:rPr>
@@ -827,7 +2341,7 @@
           <w:i/>
           <w:sz w:val="24"/>
         </w:rPr>
-        <w:t>transverse interspinous view</w:t>
+        <w:t>interspace</w:t>
       </w:r>
       <w:r>
         <w:rPr>
@@ -836,43 +2350,7 @@
           <w:i w:val="0"/>
           <w:sz w:val="24"/>
         </w:rPr>
-        <w:t xml:space="preserve"> dan </w:t>
-      </w:r>
-      <w:r>
-        <w:rPr>
-          <w:rFonts w:ascii="Times New Roman" w:hAnsi="Times New Roman" w:eastAsia="Times New Roman"/>
-          <w:b w:val="0"/>
-          <w:i/>
-          <w:sz w:val="24"/>
-        </w:rPr>
-        <w:t>paramedian sagittal oblique view</w:t>
-      </w:r>
-      <w:r>
-        <w:rPr>
-          <w:rFonts w:ascii="Times New Roman" w:hAnsi="Times New Roman" w:eastAsia="Times New Roman"/>
-          <w:b w:val="0"/>
-          <w:i w:val="0"/>
-          <w:sz w:val="24"/>
-        </w:rPr>
-        <w:t xml:space="preserve">. Potongan transversal membantu mengenali garis tengah, kompleks posterior, kompleks anterior, dan perkiraan kedalaman target. Potongan paramedian sagital oblik sangat berguna untuk melihat susunan lamina yang membentuk pola </w:t>
-      </w:r>
-      <w:r>
-        <w:rPr>
-          <w:rFonts w:ascii="Times New Roman" w:hAnsi="Times New Roman" w:eastAsia="Times New Roman"/>
-          <w:b w:val="0"/>
-          <w:i/>
-          <w:sz w:val="24"/>
-        </w:rPr>
-        <w:t>sawtooth</w:t>
-      </w:r>
-      <w:r>
-        <w:rPr>
-          <w:rFonts w:ascii="Times New Roman" w:hAnsi="Times New Roman" w:eastAsia="Times New Roman"/>
-          <w:b w:val="0"/>
-          <w:i w:val="0"/>
-          <w:sz w:val="24"/>
-        </w:rPr>
-        <w:t xml:space="preserve"> serta menilai celah interlaminar yang paling sesuai untuk jalur jarum.[3,5]</w:t>
+        <w:t>, dan memperkirakan kedalaman ruang epidural secara lebih objektif.[1-4]</w:t>
       </w:r>
     </w:p>
     <w:p/>
@@ -887,7 +2365,7 @@
           <w:i w:val="0"/>
           <w:sz w:val="24"/>
         </w:rPr>
-        <w:t>4. Gambaran sonografi ruang epidural</w:t>
+        <w:t>2. Pasien dengan kelainan struktur tulang</w:t>
       </w:r>
     </w:p>
     <w:p/>
@@ -902,7 +2380,7 @@
           <w:i w:val="0"/>
           <w:sz w:val="24"/>
         </w:rPr>
-        <w:t xml:space="preserve">Pada ultrasonografi neuraksial, ruang epidural tidak selalu tampak sebagai rongga yang jelas. Yang lebih penting ialah identifikasi </w:t>
+        <w:t xml:space="preserve">Pada pasien dengan skoliosis, </w:t>
       </w:r>
       <w:r>
         <w:rPr>
@@ -911,7 +2389,7 @@
           <w:i/>
           <w:sz w:val="24"/>
         </w:rPr>
-        <w:t>posterior complex</w:t>
+        <w:t>ankylosing spondylitis</w:t>
       </w:r>
       <w:r>
         <w:rPr>
@@ -920,40 +2398,7 @@
           <w:i w:val="0"/>
           <w:sz w:val="24"/>
         </w:rPr>
-        <w:t xml:space="preserve"> dan </w:t>
-      </w:r>
-      <w:r>
-        <w:rPr>
-          <w:rFonts w:ascii="Times New Roman" w:hAnsi="Times New Roman" w:eastAsia="Times New Roman"/>
-          <w:b w:val="0"/>
-          <w:i/>
-          <w:sz w:val="24"/>
-        </w:rPr>
-        <w:t>anterior complex</w:t>
-      </w:r>
-      <w:r>
-        <w:rPr>
-          <w:rFonts w:ascii="Times New Roman" w:hAnsi="Times New Roman" w:eastAsia="Times New Roman"/>
-          <w:b w:val="0"/>
-          <w:i w:val="0"/>
-          <w:sz w:val="24"/>
-        </w:rPr>
-        <w:t>. Kedua penanda ini membantu operator memperkirakan lokasi relatif ruang epidural dan menyesuaikan arah insersi jarum. Penilaian tersebut sangat bermanfaat pada tindakan epidural yang sulit.[3,5]</w:t>
-      </w:r>
-    </w:p>
-    <w:p/>
-    <w:p>
-      <w:pPr>
-        <w:pStyle w:val="Heading2"/>
-      </w:pPr>
-      <w:r>
-        <w:rPr>
-          <w:rFonts w:ascii="Times New Roman" w:hAnsi="Times New Roman" w:eastAsia="Times New Roman"/>
-          <w:b/>
-          <w:i w:val="0"/>
-          <w:sz w:val="24"/>
-        </w:rPr>
-        <w:t>D. Prosedur Panduan USG pada Blok Epidural</w:t>
+        <w:t>, atau perubahan degeneratif lansia, orientasi struktur tulang belakang dapat berubah. Ultrasonografi membantu menemukan jendela akustik yang lebih baik dan membantu memilih jalur median atau paramedian yang paling memungkinkan.[3,5,7]</w:t>
       </w:r>
     </w:p>
     <w:p/>
@@ -968,7 +2413,7 @@
           <w:i w:val="0"/>
           <w:sz w:val="24"/>
         </w:rPr>
-        <w:t>1. Pindaian pra-tindakan</w:t>
+        <w:t>3. Pasien pascaoperasi vertebra atau instrumen spinal</w:t>
       </w:r>
     </w:p>
     <w:p/>
@@ -983,7 +2428,22 @@
           <w:i w:val="0"/>
           <w:sz w:val="24"/>
         </w:rPr>
-        <w:t>Pindaian pra-tindakan dilakukan sebelum jarum dimasukkan. Operator mengenali sakrum, menghitung sela intervertebra dari kaudal ke kranial, menentukan garis tengah, memilih titik pungsi, dan memperkirakan kedalaman ruang epidural. Pendekatan ini merupakan bentuk penggunaan ultrasonografi yang paling praktis dan paling banyak didukung bukti ilmiah untuk meningkatkan keberhasilan tindakan epidural.[1-5]</w:t>
+        <w:t>Pada pasien pascaoperasi vertebra atau pasien dengan instrumen spinal, jaringan parut dan perubahan anatomi pascabedah dapat menyulitkan pungsi. Ultrasonografi berguna untuk menilai celah intervertebra yang masih dapat diakses dan memperkirakan jalur insersi yang paling rasional.[3,5,7]</w:t>
+      </w:r>
+    </w:p>
+    <w:p/>
+    <w:p>
+      <w:pPr>
+        <w:pStyle w:val="Heading3"/>
+      </w:pPr>
+      <w:r>
+        <w:rPr>
+          <w:rFonts w:ascii="Times New Roman" w:hAnsi="Times New Roman" w:eastAsia="Times New Roman"/>
+          <w:b/>
+          <w:i w:val="0"/>
+          <w:sz w:val="24"/>
+        </w:rPr>
+        <w:t>4. Pasien obstetri</w:t>
       </w:r>
     </w:p>
     <w:p/>
@@ -998,7 +2458,7 @@
           <w:i w:val="0"/>
           <w:sz w:val="24"/>
         </w:rPr>
-        <w:t>Selain menentukan level pungsi, ultrasonografi pra-tindakan membantu operator memperkirakan arah kraniokaudal dan mediolateral yang paling sesuai. Hal ini bermanfaat untuk mengurangi percobaan berulang dan mempersingkat proses penyesuaian arah jarum setelah kulit ditembus.[1-4]</w:t>
+        <w:t>Pasien obstetri merupakan kelompok yang paling banyak dibahas dalam sumber-sumber yang digunakan pada referat ini. Perubahan anatomi selama kehamilan dan sulitnya palpasi penanda anatomi menyebabkan ultrasonografi pra-tindakan sangat berguna untuk meningkatkan keberhasilan tusukan pertama dan menurunkan jumlah percobaan.[1-4]</w:t>
       </w:r>
     </w:p>
     <w:p/>
@@ -1013,16 +2473,7 @@
           <w:i w:val="0"/>
           <w:sz w:val="24"/>
         </w:rPr>
-        <w:t xml:space="preserve">2. Panduan ultrasonografi </w:t>
-      </w:r>
-      <w:r>
-        <w:rPr>
-          <w:rFonts w:ascii="Times New Roman" w:hAnsi="Times New Roman" w:eastAsia="Times New Roman"/>
-          <w:b/>
-          <w:i/>
-          <w:sz w:val="24"/>
-        </w:rPr>
-        <w:t>real-time</w:t>
+        <w:t>5. Populasi pediatrik</w:t>
       </w:r>
     </w:p>
     <w:p/>
@@ -1037,61 +2488,22 @@
           <w:i w:val="0"/>
           <w:sz w:val="24"/>
         </w:rPr>
-        <w:t xml:space="preserve">Panduan ultrasonografi </w:t>
-      </w:r>
-      <w:r>
-        <w:rPr>
-          <w:rFonts w:ascii="Times New Roman" w:hAnsi="Times New Roman" w:eastAsia="Times New Roman"/>
-          <w:b w:val="0"/>
-          <w:i/>
-          <w:sz w:val="24"/>
-        </w:rPr>
-        <w:t>real-time</w:t>
-      </w:r>
-      <w:r>
-        <w:rPr>
-          <w:rFonts w:ascii="Times New Roman" w:hAnsi="Times New Roman" w:eastAsia="Times New Roman"/>
-          <w:b w:val="0"/>
+        <w:t>Pada populasi pediatrik, struktur neuraksial cenderung lebih dangkal sehingga ultrasonografi berpotensi sangat membantu. Walaupun sumber yang digunakan pada referat ini lebih menekankan populasi dewasa dan obstetri, prinsip penggunaan ultrasonografi pada pediatrik tetap meliputi identifikasi anatomi, pengukuran kedalaman, dan optimasi trajektori insersi jarum.[3,5]</w:t>
+      </w:r>
+    </w:p>
+    <w:p/>
+    <w:p>
+      <w:pPr>
+        <w:pStyle w:val="Heading1"/>
+      </w:pPr>
+      <w:r>
+        <w:rPr>
+          <w:rFonts w:ascii="Times New Roman" w:hAnsi="Times New Roman" w:eastAsia="Times New Roman"/>
+          <w:b/>
           <w:i w:val="0"/>
           <w:sz w:val="24"/>
         </w:rPr>
-        <w:t xml:space="preserve"> berarti transduser tetap dipertahankan pada posisi pindaian selama jarum dimajukan. Teknik ini dapat dilakukan dengan pendekatan </w:t>
-      </w:r>
-      <w:r>
-        <w:rPr>
-          <w:rFonts w:ascii="Times New Roman" w:hAnsi="Times New Roman" w:eastAsia="Times New Roman"/>
-          <w:b w:val="0"/>
-          <w:i/>
-          <w:sz w:val="24"/>
-        </w:rPr>
-        <w:t>in-plane</w:t>
-      </w:r>
-      <w:r>
-        <w:rPr>
-          <w:rFonts w:ascii="Times New Roman" w:hAnsi="Times New Roman" w:eastAsia="Times New Roman"/>
-          <w:b w:val="0"/>
-          <w:i w:val="0"/>
-          <w:sz w:val="24"/>
-        </w:rPr>
-        <w:t xml:space="preserve"> atau </w:t>
-      </w:r>
-      <w:r>
-        <w:rPr>
-          <w:rFonts w:ascii="Times New Roman" w:hAnsi="Times New Roman" w:eastAsia="Times New Roman"/>
-          <w:b w:val="0"/>
-          <w:i/>
-          <w:sz w:val="24"/>
-        </w:rPr>
-        <w:t>out-of-plane</w:t>
-      </w:r>
-      <w:r>
-        <w:rPr>
-          <w:rFonts w:ascii="Times New Roman" w:hAnsi="Times New Roman" w:eastAsia="Times New Roman"/>
-          <w:b w:val="0"/>
-          <w:i w:val="0"/>
-          <w:sz w:val="24"/>
-        </w:rPr>
-        <w:t>. Secara teoretis, teknik ini memberi keuntungan karena hubungan antara jarum dan anatomi dapat dipantau lebih langsung, tetapi penerapannya jauh lebih menantang akibat keterbatasan ruang gerak, hambatan tulang, dan sulitnya mempertahankan visualisasi jarum secara konsisten.[3,5]</w:t>
+        <w:t>BAB III. KESIMPULAN</w:t>
       </w:r>
     </w:p>
     <w:p/>
@@ -1106,7 +2518,7 @@
           <w:i w:val="0"/>
           <w:sz w:val="24"/>
         </w:rPr>
-        <w:t xml:space="preserve">Karena alasan tersebut, penggunaan ultrasonografi sebelum tindakan tetap lebih mudah diterapkan secara rutin. Panduan </w:t>
+        <w:t xml:space="preserve">Ultrasonografi merupakan alat bantu yang bernilai dalam meningkatkan keberhasilan tindakan blok epidural. Keunggulan utamanya terletak pada kemampuannya mengidentifikasi level pungsi, garis tengah, jendela akustik terbaik, perkiraan kedalaman ruang epidural, dan arah insersi jarum yang lebih tepat. Bukti yang tersedia menunjukkan bahwa ultrasonografi pra-tindakan meningkatkan keberhasilan tusukan pertama dan menurunkan jumlah percobaan, terutama pada pasien obstetri dan pasien dengan anatomi sulit. Sementara itu, panduan ultrasonografi </w:t>
       </w:r>
       <w:r>
         <w:rPr>
@@ -1124,13 +2536,13 @@
           <w:i w:val="0"/>
           <w:sz w:val="24"/>
         </w:rPr>
-        <w:t xml:space="preserve"> lebih tepat dipandang sebagai teknik lanjutan yang memerlukan pengalaman dan koordinasi tangan-mata yang lebih baik.[3,5]</w:t>
+        <w:t xml:space="preserve"> tetap menjanjikan, tetapi lebih menuntut keterampilan teknis. Dengan demikian, integrasi ultrasonografi ke dalam praktik blok epidural layak dipertimbangkan untuk meningkatkan keselamatan, efisiensi, dan mutu pelayanan anestesi neuraksial.[1-7]</w:t>
       </w:r>
     </w:p>
     <w:p/>
     <w:p>
       <w:pPr>
-        <w:pStyle w:val="Heading2"/>
+        <w:pStyle w:val="Heading1"/>
       </w:pPr>
       <w:r>
         <w:rPr>
@@ -1139,22 +2551,7 @@
           <w:i w:val="0"/>
           <w:sz w:val="24"/>
         </w:rPr>
-        <w:t>E. Penggunaan USG pada Populasi Anatomi Sulit</w:t>
-      </w:r>
-    </w:p>
-    <w:p/>
-    <w:p>
-      <w:pPr>
-        <w:pStyle w:val="Heading3"/>
-      </w:pPr>
-      <w:r>
-        <w:rPr>
-          <w:rFonts w:ascii="Times New Roman" w:hAnsi="Times New Roman" w:eastAsia="Times New Roman"/>
-          <w:b/>
-          <w:i w:val="0"/>
-          <w:sz w:val="24"/>
-        </w:rPr>
-        <w:t>1. Pasien obesitas</w:t>
+        <w:t>PETUNJUK GAMBAR YANG DISARANKAN</w:t>
       </w:r>
     </w:p>
     <w:p/>
@@ -1169,22 +2566,7 @@
           <w:i w:val="0"/>
           <w:sz w:val="24"/>
         </w:rPr>
-        <w:t>Pada pasien obesitas, ketebalan jaringan lunak membuat palpasi prosesus spinosus dan identifikasi garis interkrista menjadi kurang andal. Ultrasonografi membantu menemukan garis tengah, memilih sela intervertebra, serta memperkirakan kedalaman ruang epidural dengan lebih objektif. Oleh karena itu, kelompok ini termasuk yang paling jelas memperoleh manfaat dari ultrasonografi neuraksial.[1-4]</w:t>
-      </w:r>
-    </w:p>
-    <w:p/>
-    <w:p>
-      <w:pPr>
-        <w:pStyle w:val="Heading3"/>
-      </w:pPr>
-      <w:r>
-        <w:rPr>
-          <w:rFonts w:ascii="Times New Roman" w:hAnsi="Times New Roman" w:eastAsia="Times New Roman"/>
-          <w:b/>
-          <w:i w:val="0"/>
-          <w:sz w:val="24"/>
-        </w:rPr>
-        <w:t>2. Pasien dengan kelainan struktur tulang</w:t>
+        <w:t>Gambar dari jurnal dan buku tetap memiliki hak cipta, sehingga file referat ini tidak menyalin ulang gambar asli ke dalam repositori. Namun, agar referat Anda lebih lengkap dan sesuai pembahasan teknis, gambar berikut sangat disarankan untuk dimasukkan ke dokumen akhir dengan tetap mencantumkan sumber asli.</w:t>
       </w:r>
     </w:p>
     <w:p/>
@@ -1199,22 +2581,30 @@
           <w:i w:val="0"/>
           <w:sz w:val="24"/>
         </w:rPr>
-        <w:t>Pada pasien dengan skoliosis, spondilitis ankilosa, atau perubahan degeneratif, orientasi struktur tulang belakang dapat berubah sehingga jalur median konvensional menjadi lebih sukar. Ultrasonografi membantu operator memilih jalur yang paling memungkinkan, terutama bila jalur paramedian memberikan jendela akustik yang lebih baik.[3,5]</w:t>
+        <w:t xml:space="preserve">1. </w:t>
+      </w:r>
+      <w:r>
+        <w:rPr>
+          <w:rFonts w:ascii="Times New Roman" w:hAnsi="Times New Roman" w:eastAsia="Times New Roman"/>
+          <w:b/>
+          <w:i w:val="0"/>
+          <w:sz w:val="24"/>
+        </w:rPr>
+        <w:t>Gambar anatomi vertebra torakal dan lumbal</w:t>
       </w:r>
     </w:p>
-    <w:p/>
     <w:p>
       <w:pPr>
-        <w:pStyle w:val="Heading3"/>
+        <w:jc w:val="both"/>
       </w:pPr>
       <w:r>
         <w:rPr>
           <w:rFonts w:ascii="Times New Roman" w:hAnsi="Times New Roman" w:eastAsia="Times New Roman"/>
-          <w:b/>
+          <w:b w:val="0"/>
           <w:i w:val="0"/>
           <w:sz w:val="24"/>
         </w:rPr>
-        <w:t>3. Pasien pascaoperasi vertebra atau instrumen spinal</w:t>
+        <w:t>Letakkan pada subbab II.A.1. Pilih gambar yang menampilkan korpus, pedikel, lamina, prosesus spinosus, dan prosesus artikularis. Sumber yang paling sesuai: `Manuel Pardo epidural.pdf`, `epidural_Michael A. Gropper (editor) - Miller's Anesthesia, 2-Volume Set-Elsevier (2024)_Extracted.pdf`.[6,7]</w:t>
       </w:r>
     </w:p>
     <w:p/>
@@ -1229,22 +2619,30 @@
           <w:i w:val="0"/>
           <w:sz w:val="24"/>
         </w:rPr>
-        <w:t>Pada pasien pascaoperasi tulang belakang, jaringan parut dan perubahan anatomi pascabedah dapat mempersulit tindakan neuraksial. Ultrasonografi tetap bermanfaat untuk menilai celah intervertebra yang masih dapat diakses dan membantu memperkirakan jalur insersi yang paling rasional.[3,5]</w:t>
+        <w:t xml:space="preserve">2. </w:t>
+      </w:r>
+      <w:r>
+        <w:rPr>
+          <w:rFonts w:ascii="Times New Roman" w:hAnsi="Times New Roman" w:eastAsia="Times New Roman"/>
+          <w:b/>
+          <w:i w:val="0"/>
+          <w:sz w:val="24"/>
+        </w:rPr>
+        <w:t>Gambar lintasan jarum median dan paramedian</w:t>
       </w:r>
     </w:p>
-    <w:p/>
     <w:p>
       <w:pPr>
-        <w:pStyle w:val="Heading3"/>
+        <w:jc w:val="both"/>
       </w:pPr>
       <w:r>
         <w:rPr>
           <w:rFonts w:ascii="Times New Roman" w:hAnsi="Times New Roman" w:eastAsia="Times New Roman"/>
-          <w:b/>
+          <w:b w:val="0"/>
           <w:i w:val="0"/>
           <w:sz w:val="24"/>
         </w:rPr>
-        <w:t>4. Pasien obstetri</w:t>
+        <w:t>Letakkan pada subbab II.A.1 atau II.B.1. Gambar ini penting untuk menjelaskan hubungan anatomi dengan jalur jarum pada blok epidural. Sumber yang paling sesuai: `Manuel Pardo epidural.pdf`.[6]</w:t>
       </w:r>
     </w:p>
     <w:p/>
@@ -1259,22 +2657,30 @@
           <w:i w:val="0"/>
           <w:sz w:val="24"/>
         </w:rPr>
-        <w:t>Pasien obstetri merupakan kelompok yang paling sering dibahas dalam sumber-sumber yang digunakan pada referat ini. Kehamilan, perubahan postur, dan tidak jelasnya penanda anatomi permukaan tubuh dapat menyulitkan tindakan epidural. Meta-analisis pada populasi obstetri menunjukkan bahwa ultrasonografi pra-tindakan meningkatkan keberhasilan tusukan pertama dan terutama bermanfaat pada kasus yang diperkirakan sulit.[1,4]</w:t>
+        <w:t xml:space="preserve">3. </w:t>
+      </w:r>
+      <w:r>
+        <w:rPr>
+          <w:rFonts w:ascii="Times New Roman" w:hAnsi="Times New Roman" w:eastAsia="Times New Roman"/>
+          <w:b/>
+          <w:i w:val="0"/>
+          <w:sz w:val="24"/>
+        </w:rPr>
+        <w:t>Gambar penanda anatomi permukaan tubuh</w:t>
       </w:r>
     </w:p>
-    <w:p/>
     <w:p>
       <w:pPr>
-        <w:pStyle w:val="Heading3"/>
+        <w:jc w:val="both"/>
       </w:pPr>
       <w:r>
         <w:rPr>
           <w:rFonts w:ascii="Times New Roman" w:hAnsi="Times New Roman" w:eastAsia="Times New Roman"/>
-          <w:b/>
+          <w:b w:val="0"/>
           <w:i w:val="0"/>
           <w:sz w:val="24"/>
         </w:rPr>
-        <w:t>5. Populasi pediatrik</w:t>
+        <w:t>Letakkan pada subbab II.A.4. Pilih gambar garis Tuffier atau garis interkrista serta hubungan level lumbalnya. Sumber yang paling sesuai: `Ultrasound guidance for neuraxial anesthesia techniques - UpToDate.pdf`.[3]</w:t>
       </w:r>
     </w:p>
     <w:p/>
@@ -1289,7 +2695,344 @@
           <w:i w:val="0"/>
           <w:sz w:val="24"/>
         </w:rPr>
-        <w:t>Pada populasi pediatrik, prinsip pemetaan anatomi dengan ultrasonografi tetap relevan karena struktur neuraksial lebih dangkal. Namun, berdasarkan sumber yang digunakan dalam referat ini, pembahasan khusus mengenai pediatrik tidak sedalam pembahasan pada populasi dewasa dan obstetri. Oleh sebab itu, ultrasonografi pada populasi ini dapat dipahami melalui prinsip umum identifikasi anatomi, estimasi kedalaman, dan optimasi arah insersi jarum.[3,5]</w:t>
+        <w:t xml:space="preserve">4. </w:t>
+      </w:r>
+      <w:r>
+        <w:rPr>
+          <w:rFonts w:ascii="Times New Roman" w:hAnsi="Times New Roman" w:eastAsia="Times New Roman"/>
+          <w:b/>
+          <w:i w:val="0"/>
+          <w:sz w:val="24"/>
+        </w:rPr>
+        <w:t>Gambar posisi probe atau transduser dan bidang pindaian</w:t>
+      </w:r>
+    </w:p>
+    <w:p>
+      <w:pPr>
+        <w:jc w:val="both"/>
+      </w:pPr>
+      <w:r>
+        <w:rPr>
+          <w:rFonts w:ascii="Times New Roman" w:hAnsi="Times New Roman" w:eastAsia="Times New Roman"/>
+          <w:b w:val="0"/>
+          <w:i w:val="0"/>
+          <w:sz w:val="24"/>
+        </w:rPr>
+        <w:t xml:space="preserve">Letakkan pada subbab II.C.1 dan II.C.3. Cantumkan gambar </w:t>
+      </w:r>
+      <w:r>
+        <w:rPr>
+          <w:rFonts w:ascii="Times New Roman" w:hAnsi="Times New Roman" w:eastAsia="Times New Roman"/>
+          <w:b w:val="0"/>
+          <w:i/>
+          <w:sz w:val="24"/>
+        </w:rPr>
+        <w:t>transverse interspinous view</w:t>
+      </w:r>
+      <w:r>
+        <w:rPr>
+          <w:rFonts w:ascii="Times New Roman" w:hAnsi="Times New Roman" w:eastAsia="Times New Roman"/>
+          <w:b w:val="0"/>
+          <w:i w:val="0"/>
+          <w:sz w:val="24"/>
+        </w:rPr>
+        <w:t xml:space="preserve">, </w:t>
+      </w:r>
+      <w:r>
+        <w:rPr>
+          <w:rFonts w:ascii="Times New Roman" w:hAnsi="Times New Roman" w:eastAsia="Times New Roman"/>
+          <w:b w:val="0"/>
+          <w:i/>
+          <w:sz w:val="24"/>
+        </w:rPr>
+        <w:t>transverse medial view</w:t>
+      </w:r>
+      <w:r>
+        <w:rPr>
+          <w:rFonts w:ascii="Times New Roman" w:hAnsi="Times New Roman" w:eastAsia="Times New Roman"/>
+          <w:b w:val="0"/>
+          <w:i w:val="0"/>
+          <w:sz w:val="24"/>
+        </w:rPr>
+        <w:t xml:space="preserve">, dan </w:t>
+      </w:r>
+      <w:r>
+        <w:rPr>
+          <w:rFonts w:ascii="Times New Roman" w:hAnsi="Times New Roman" w:eastAsia="Times New Roman"/>
+          <w:b w:val="0"/>
+          <w:i/>
+          <w:sz w:val="24"/>
+        </w:rPr>
+        <w:t>paramedian sagittal oblique view</w:t>
+      </w:r>
+      <w:r>
+        <w:rPr>
+          <w:rFonts w:ascii="Times New Roman" w:hAnsi="Times New Roman" w:eastAsia="Times New Roman"/>
+          <w:b w:val="0"/>
+          <w:i w:val="0"/>
+          <w:sz w:val="24"/>
+        </w:rPr>
+        <w:t>. Sumber yang paling sesuai: `usg spine hadzics textbook RA and pain_Extracted.pdf`, `Ultrasound guidance for neuraxial anesthesia techniques - UpToDate.pdf`.[3,5]</w:t>
+      </w:r>
+    </w:p>
+    <w:p/>
+    <w:p>
+      <w:pPr>
+        <w:jc w:val="both"/>
+      </w:pPr>
+      <w:r>
+        <w:rPr>
+          <w:rFonts w:ascii="Times New Roman" w:hAnsi="Times New Roman" w:eastAsia="Times New Roman"/>
+          <w:b w:val="0"/>
+          <w:i w:val="0"/>
+          <w:sz w:val="24"/>
+        </w:rPr>
+        <w:t xml:space="preserve">5. </w:t>
+      </w:r>
+      <w:r>
+        <w:rPr>
+          <w:rFonts w:ascii="Times New Roman" w:hAnsi="Times New Roman" w:eastAsia="Times New Roman"/>
+          <w:b/>
+          <w:i w:val="0"/>
+          <w:sz w:val="24"/>
+        </w:rPr>
+        <w:t>Gambar pola sonografi tulang belakang</w:t>
+      </w:r>
+    </w:p>
+    <w:p>
+      <w:pPr>
+        <w:jc w:val="both"/>
+      </w:pPr>
+      <w:r>
+        <w:rPr>
+          <w:rFonts w:ascii="Times New Roman" w:hAnsi="Times New Roman" w:eastAsia="Times New Roman"/>
+          <w:b w:val="0"/>
+          <w:i w:val="0"/>
+          <w:sz w:val="24"/>
+        </w:rPr>
+        <w:t xml:space="preserve">Letakkan pada subbab II.C.2 dan II.C.4. Pilih gambar yang memperlihatkan </w:t>
+      </w:r>
+      <w:r>
+        <w:rPr>
+          <w:rFonts w:ascii="Times New Roman" w:hAnsi="Times New Roman" w:eastAsia="Times New Roman"/>
+          <w:b w:val="0"/>
+          <w:i/>
+          <w:sz w:val="24"/>
+        </w:rPr>
+        <w:t>acoustic shadowing</w:t>
+      </w:r>
+      <w:r>
+        <w:rPr>
+          <w:rFonts w:ascii="Times New Roman" w:hAnsi="Times New Roman" w:eastAsia="Times New Roman"/>
+          <w:b w:val="0"/>
+          <w:i w:val="0"/>
+          <w:sz w:val="24"/>
+        </w:rPr>
+        <w:t xml:space="preserve">, </w:t>
+      </w:r>
+      <w:r>
+        <w:rPr>
+          <w:rFonts w:ascii="Times New Roman" w:hAnsi="Times New Roman" w:eastAsia="Times New Roman"/>
+          <w:b w:val="0"/>
+          <w:i/>
+          <w:sz w:val="24"/>
+        </w:rPr>
+        <w:t>acoustic window</w:t>
+      </w:r>
+      <w:r>
+        <w:rPr>
+          <w:rFonts w:ascii="Times New Roman" w:hAnsi="Times New Roman" w:eastAsia="Times New Roman"/>
+          <w:b w:val="0"/>
+          <w:i w:val="0"/>
+          <w:sz w:val="24"/>
+        </w:rPr>
+        <w:t xml:space="preserve">, pola </w:t>
+      </w:r>
+      <w:r>
+        <w:rPr>
+          <w:rFonts w:ascii="Times New Roman" w:hAnsi="Times New Roman" w:eastAsia="Times New Roman"/>
+          <w:b w:val="0"/>
+          <w:i/>
+          <w:sz w:val="24"/>
+        </w:rPr>
+        <w:t>sawtooth</w:t>
+      </w:r>
+      <w:r>
+        <w:rPr>
+          <w:rFonts w:ascii="Times New Roman" w:hAnsi="Times New Roman" w:eastAsia="Times New Roman"/>
+          <w:b w:val="0"/>
+          <w:i w:val="0"/>
+          <w:sz w:val="24"/>
+        </w:rPr>
+        <w:t xml:space="preserve">, </w:t>
+      </w:r>
+      <w:r>
+        <w:rPr>
+          <w:rFonts w:ascii="Times New Roman" w:hAnsi="Times New Roman" w:eastAsia="Times New Roman"/>
+          <w:b w:val="0"/>
+          <w:i/>
+          <w:sz w:val="24"/>
+        </w:rPr>
+        <w:t>posterior complex</w:t>
+      </w:r>
+      <w:r>
+        <w:rPr>
+          <w:rFonts w:ascii="Times New Roman" w:hAnsi="Times New Roman" w:eastAsia="Times New Roman"/>
+          <w:b w:val="0"/>
+          <w:i w:val="0"/>
+          <w:sz w:val="24"/>
+        </w:rPr>
+        <w:t xml:space="preserve">, dan </w:t>
+      </w:r>
+      <w:r>
+        <w:rPr>
+          <w:rFonts w:ascii="Times New Roman" w:hAnsi="Times New Roman" w:eastAsia="Times New Roman"/>
+          <w:b w:val="0"/>
+          <w:i/>
+          <w:sz w:val="24"/>
+        </w:rPr>
+        <w:t>anterior complex</w:t>
+      </w:r>
+      <w:r>
+        <w:rPr>
+          <w:rFonts w:ascii="Times New Roman" w:hAnsi="Times New Roman" w:eastAsia="Times New Roman"/>
+          <w:b w:val="0"/>
+          <w:i w:val="0"/>
+          <w:sz w:val="24"/>
+        </w:rPr>
+        <w:t>. Sumber yang paling sesuai: `usg spine hadzics textbook RA and pain_Extracted.pdf`.[5]</w:t>
+      </w:r>
+    </w:p>
+    <w:p/>
+    <w:p>
+      <w:pPr>
+        <w:jc w:val="both"/>
+      </w:pPr>
+      <w:r>
+        <w:rPr>
+          <w:rFonts w:ascii="Times New Roman" w:hAnsi="Times New Roman" w:eastAsia="Times New Roman"/>
+          <w:b w:val="0"/>
+          <w:i w:val="0"/>
+          <w:sz w:val="24"/>
+        </w:rPr>
+        <w:t xml:space="preserve">6. </w:t>
+      </w:r>
+      <w:r>
+        <w:rPr>
+          <w:rFonts w:ascii="Times New Roman" w:hAnsi="Times New Roman" w:eastAsia="Times New Roman"/>
+          <w:b/>
+          <w:i w:val="0"/>
+          <w:sz w:val="24"/>
+        </w:rPr>
+        <w:t>Gambar pengukuran EDD</w:t>
+      </w:r>
+    </w:p>
+    <w:p>
+      <w:pPr>
+        <w:jc w:val="both"/>
+      </w:pPr>
+      <w:r>
+        <w:rPr>
+          <w:rFonts w:ascii="Times New Roman" w:hAnsi="Times New Roman" w:eastAsia="Times New Roman"/>
+          <w:b w:val="0"/>
+          <w:i w:val="0"/>
+          <w:sz w:val="24"/>
+        </w:rPr>
+        <w:t>Letakkan pada subbab II.A.3 atau II.D.1.c. Pilih gambar atau tangkapan citra yang menunjukkan pengukuran jarak dari kulit ke ruang epidural. Sumber yang paling sesuai: `Pre-Procedural Lumbar Neuraxial Ultrasound—A Systematic.pdf`, `Ultrasound guidance for neuraxial anesthesia techniques - UpToDate.pdf`.[2,3]</w:t>
+      </w:r>
+    </w:p>
+    <w:p/>
+    <w:p>
+      <w:pPr>
+        <w:jc w:val="both"/>
+      </w:pPr>
+      <w:r>
+        <w:rPr>
+          <w:rFonts w:ascii="Times New Roman" w:hAnsi="Times New Roman" w:eastAsia="Times New Roman"/>
+          <w:b w:val="0"/>
+          <w:i w:val="0"/>
+          <w:sz w:val="24"/>
+        </w:rPr>
+        <w:t xml:space="preserve">7. </w:t>
+      </w:r>
+      <w:r>
+        <w:rPr>
+          <w:rFonts w:ascii="Times New Roman" w:hAnsi="Times New Roman" w:eastAsia="Times New Roman"/>
+          <w:b/>
+          <w:i w:val="0"/>
+          <w:sz w:val="24"/>
+        </w:rPr>
+        <w:t>Gambar alur pindaian pra-tindakan</w:t>
+      </w:r>
+    </w:p>
+    <w:p>
+      <w:pPr>
+        <w:jc w:val="both"/>
+      </w:pPr>
+      <w:r>
+        <w:rPr>
+          <w:rFonts w:ascii="Times New Roman" w:hAnsi="Times New Roman" w:eastAsia="Times New Roman"/>
+          <w:b w:val="0"/>
+          <w:i w:val="0"/>
+          <w:sz w:val="24"/>
+        </w:rPr>
+        <w:t xml:space="preserve">Letakkan pada subbab II.D.1. Pilih gambar yang menunjukkan identifikasi sakrum, sela L5-S1, penghitungan ke kranial, penentuan </w:t>
+      </w:r>
+      <w:r>
+        <w:rPr>
+          <w:rFonts w:ascii="Times New Roman" w:hAnsi="Times New Roman" w:eastAsia="Times New Roman"/>
+          <w:b w:val="0"/>
+          <w:i/>
+          <w:sz w:val="24"/>
+        </w:rPr>
+        <w:t>line of symmetry</w:t>
+      </w:r>
+      <w:r>
+        <w:rPr>
+          <w:rFonts w:ascii="Times New Roman" w:hAnsi="Times New Roman" w:eastAsia="Times New Roman"/>
+          <w:b w:val="0"/>
+          <w:i w:val="0"/>
+          <w:sz w:val="24"/>
+        </w:rPr>
+        <w:t>, dan penandaan titik pungsi. Sumber yang paling sesuai: `Ultrasound guidance for neuraxial anesthesia techniques - UpToDate.pdf`, `usg spine hadzics textbook RA and pain_Extracted.pdf`.[3,5]</w:t>
+      </w:r>
+    </w:p>
+    <w:p/>
+    <w:p>
+      <w:pPr>
+        <w:jc w:val="both"/>
+      </w:pPr>
+      <w:r>
+        <w:rPr>
+          <w:rFonts w:ascii="Times New Roman" w:hAnsi="Times New Roman" w:eastAsia="Times New Roman"/>
+          <w:b w:val="0"/>
+          <w:i w:val="0"/>
+          <w:sz w:val="24"/>
+        </w:rPr>
+        <w:t xml:space="preserve">8. </w:t>
+      </w:r>
+      <w:r>
+        <w:rPr>
+          <w:rFonts w:ascii="Times New Roman" w:hAnsi="Times New Roman" w:eastAsia="Times New Roman"/>
+          <w:b/>
+          <w:i w:val="0"/>
+          <w:sz w:val="24"/>
+        </w:rPr>
+        <w:t>Gambar manfaat USG pada pasien obstetri atau anatomi sulit</w:t>
+      </w:r>
+    </w:p>
+    <w:p>
+      <w:pPr>
+        <w:jc w:val="both"/>
+      </w:pPr>
+      <w:r>
+        <w:rPr>
+          <w:rFonts w:ascii="Times New Roman" w:hAnsi="Times New Roman" w:eastAsia="Times New Roman"/>
+          <w:b w:val="0"/>
+          <w:i w:val="0"/>
+          <w:sz w:val="24"/>
+        </w:rPr>
+        <w:t>Letakkan pada subbab II.E.1 dan II.E.4. Bila tersedia, gunakan gambar yang menunjukkan kesulitan palpasi penanda anatomi atau manfaat pencitraan ultrasonografi pada populasi obstetri. Sumber yang paling sesuai: `Anaesthesia - 2020 - Young - Conventional landmark palpation vs  preprocedural ultrasound for neuraxial analgesia and.pdf`, `cochrane Ultrasound guidance versus anatomical landmarks for neuraxial.pdf`.[1,4]</w:t>
       </w:r>
     </w:p>
     <w:p/>
@@ -1304,7 +3047,7 @@
           <w:i w:val="0"/>
           <w:sz w:val="24"/>
         </w:rPr>
-        <w:t>BAB III. KESIMPULAN</w:t>
+        <w:t>Daftar Pustaka</w:t>
       </w:r>
     </w:p>
     <w:p/>
@@ -1319,79 +3062,7 @@
           <w:i w:val="0"/>
           <w:sz w:val="24"/>
         </w:rPr>
-        <w:t xml:space="preserve">Ultrasonografi merupakan alat bantu yang efektif untuk meningkatkan keberhasilan tindakan blok epidural. Manfaat utamanya terletak pada kemampuan mengidentifikasi level pungsi, garis tengah, jendela akustik terbaik, perkiraan kedalaman ruang epidural, dan arah insersi jarum yang lebih tepat. Bukti yang tersedia menunjukkan bahwa ultrasonografi pra-tindakan meningkatkan keberhasilan tusukan pertama dan menurunkan jumlah percobaan, dengan manfaat paling nyata pada pasien obstetri dan pasien dengan anatomi sulit. Sementara itu, panduan ultrasonografi </w:t>
-      </w:r>
-      <w:r>
-        <w:rPr>
-          <w:rFonts w:ascii="Times New Roman" w:hAnsi="Times New Roman" w:eastAsia="Times New Roman"/>
-          <w:b w:val="0"/>
-          <w:i/>
-          <w:sz w:val="24"/>
-        </w:rPr>
-        <w:t>real-time</w:t>
-      </w:r>
-      <w:r>
-        <w:rPr>
-          <w:rFonts w:ascii="Times New Roman" w:hAnsi="Times New Roman" w:eastAsia="Times New Roman"/>
-          <w:b w:val="0"/>
-          <w:i w:val="0"/>
-          <w:sz w:val="24"/>
-        </w:rPr>
-        <w:t xml:space="preserve"> tetap menjanjikan, tetapi lebih kompleks secara teknis. Dengan demikian, integrasi ultrasonografi dalam praktik blok epidural layak dipertimbangkan sebagai bagian dari upaya meningkatkan keamanan, efisiensi, dan mutu pelayanan anestesi regional neuraksial.[1-6]</w:t>
-      </w:r>
-    </w:p>
-    <w:p/>
-    <w:p>
-      <w:pPr>
-        <w:pStyle w:val="Heading1"/>
-      </w:pPr>
-      <w:r>
-        <w:rPr>
-          <w:rFonts w:ascii="Times New Roman" w:hAnsi="Times New Roman" w:eastAsia="Times New Roman"/>
-          <w:b/>
-          <w:i w:val="0"/>
-          <w:sz w:val="24"/>
-        </w:rPr>
-        <w:t>PETUNJUK GAMBAR YANG DISARANKAN</w:t>
-      </w:r>
-    </w:p>
-    <w:p/>
-    <w:p>
-      <w:pPr>
-        <w:jc w:val="both"/>
-      </w:pPr>
-      <w:r>
-        <w:rPr>
-          <w:rFonts w:ascii="Times New Roman" w:hAnsi="Times New Roman" w:eastAsia="Times New Roman"/>
-          <w:b w:val="0"/>
-          <w:i w:val="0"/>
-          <w:sz w:val="24"/>
-        </w:rPr>
-        <w:t>Karena gambar pada jurnal, buku, dan materi referensi memiliki hak cipta, file referat ini tidak menyalin ulang gambar asli ke dalam repositori. Namun, agar referat Anda lebih lengkap, berikut gambar yang sangat disarankan untuk dicantumkan pada dokumen akhir dengan tetap menyebutkan sumber aslinya.[3,5,6]</w:t>
-      </w:r>
-    </w:p>
-    <w:p/>
-    <w:p>
-      <w:pPr>
-        <w:jc w:val="both"/>
-      </w:pPr>
-      <w:r>
-        <w:rPr>
-          <w:rFonts w:ascii="Times New Roman" w:hAnsi="Times New Roman" w:eastAsia="Times New Roman"/>
-          <w:b w:val="0"/>
-          <w:i w:val="0"/>
-          <w:sz w:val="24"/>
-        </w:rPr>
-        <w:t xml:space="preserve">1. </w:t>
-      </w:r>
-      <w:r>
-        <w:rPr>
-          <w:rFonts w:ascii="Times New Roman" w:hAnsi="Times New Roman" w:eastAsia="Times New Roman"/>
-          <w:b/>
-          <w:i w:val="0"/>
-          <w:sz w:val="24"/>
-        </w:rPr>
-        <w:t>Gambar anatomi vertebra torakal dan lumbal</w:t>
+        <w:t>1. Young B, Onwochei D, Desai N. Conventional landmark palpation vs preprocedural ultrasound for neuraxial analgesia and anaesthesia in obstetrics: a systematic review and meta-analysis with trial sequential analyses. Anaesthesia. 2020;75(8):1001-1016. doi:10.1111/anae.15072.</w:t>
       </w:r>
     </w:p>
     <w:p>
@@ -1405,31 +3076,7 @@
           <w:i w:val="0"/>
           <w:sz w:val="24"/>
         </w:rPr>
-        <w:t>Cantumkan gambar yang menunjukkan korpus vertebra, pedikel, lamina, prosesus spinosus, dan prosesus artikularis. Gambar ini paling tepat diletakkan pada subbab anatomi neuraksial. Sumber yang paling sesuai untuk dicari pada file unggahan adalah `Manuel Pardo epidural.pdf` dan `Ultrasound guidance for neuraxial anesthesia techniques - UpToDate.pdf`.[3,6]</w:t>
-      </w:r>
-    </w:p>
-    <w:p/>
-    <w:p>
-      <w:pPr>
-        <w:jc w:val="both"/>
-      </w:pPr>
-      <w:r>
-        <w:rPr>
-          <w:rFonts w:ascii="Times New Roman" w:hAnsi="Times New Roman" w:eastAsia="Times New Roman"/>
-          <w:b w:val="0"/>
-          <w:i w:val="0"/>
-          <w:sz w:val="24"/>
-        </w:rPr>
-        <w:t xml:space="preserve">2. </w:t>
-      </w:r>
-      <w:r>
-        <w:rPr>
-          <w:rFonts w:ascii="Times New Roman" w:hAnsi="Times New Roman" w:eastAsia="Times New Roman"/>
-          <w:b/>
-          <w:i w:val="0"/>
-          <w:sz w:val="24"/>
-        </w:rPr>
-        <w:t>Gambar jalur median dan paramedian pada blok epidural</w:t>
+        <w:t>2. Sidiropoulou T, Christodoulaki K, Siristatidis C. Pre-procedural lumbar neuraxial ultrasound: a systematic review of randomized controlled trials and meta-analysis. Healthcare (Basel). 2021;9(4):479. doi:10.3390/healthcare9040479.</w:t>
       </w:r>
     </w:p>
     <w:p>
@@ -1443,31 +3090,7 @@
           <w:i w:val="0"/>
           <w:sz w:val="24"/>
         </w:rPr>
-        <w:t>Cantumkan ilustrasi perbandingan jalur median dan paramedian, termasuk lapisan jaringan yang dilalui jarum. Gambar ini penting untuk menjelaskan hubungan antara anatomi dan teknik pungsi. Sumber yang paling sesuai ialah `Manuel Pardo epidural.pdf`.[6]</w:t>
-      </w:r>
-    </w:p>
-    <w:p/>
-    <w:p>
-      <w:pPr>
-        <w:jc w:val="both"/>
-      </w:pPr>
-      <w:r>
-        <w:rPr>
-          <w:rFonts w:ascii="Times New Roman" w:hAnsi="Times New Roman" w:eastAsia="Times New Roman"/>
-          <w:b w:val="0"/>
-          <w:i w:val="0"/>
-          <w:sz w:val="24"/>
-        </w:rPr>
-        <w:t xml:space="preserve">3. </w:t>
-      </w:r>
-      <w:r>
-        <w:rPr>
-          <w:rFonts w:ascii="Times New Roman" w:hAnsi="Times New Roman" w:eastAsia="Times New Roman"/>
-          <w:b/>
-          <w:i w:val="0"/>
-          <w:sz w:val="24"/>
-        </w:rPr>
-        <w:t>Gambar penanda anatomi permukaan tubuh</w:t>
+        <w:t>3. Kamdar BB, Hao D. Ultrasound guidance for neuraxial anesthesia techniques. UpToDate. Waltham, MA: Wolters Kluwer; 2024 Oct 9. Available from: https://www.uptodate.com.</w:t>
       </w:r>
     </w:p>
     <w:p>
@@ -1481,31 +3104,7 @@
           <w:i w:val="0"/>
           <w:sz w:val="24"/>
         </w:rPr>
-        <w:t>Cantumkan gambar garis interkrista atau garis Tuffier serta letaknya terhadap vertebra lumbal. Gambar ini mendukung pembahasan keterbatasan teknik berbasis penanda anatomi. Sumber yang dapat ditelusuri ialah `Ultrasound guidance for neuraxial anesthesia techniques - UpToDate.pdf`.[3]</w:t>
-      </w:r>
-    </w:p>
-    <w:p/>
-    <w:p>
-      <w:pPr>
-        <w:jc w:val="both"/>
-      </w:pPr>
-      <w:r>
-        <w:rPr>
-          <w:rFonts w:ascii="Times New Roman" w:hAnsi="Times New Roman" w:eastAsia="Times New Roman"/>
-          <w:b w:val="0"/>
-          <w:i w:val="0"/>
-          <w:sz w:val="24"/>
-        </w:rPr>
-        <w:t xml:space="preserve">4. </w:t>
-      </w:r>
-      <w:r>
-        <w:rPr>
-          <w:rFonts w:ascii="Times New Roman" w:hAnsi="Times New Roman" w:eastAsia="Times New Roman"/>
-          <w:b/>
-          <w:i w:val="0"/>
-          <w:sz w:val="24"/>
-        </w:rPr>
-        <w:t>Gambar posisi transduser dan bidang pindaian ultrasonografi neuraksial</w:t>
+        <w:t>4. Makino Y, Miyake K, Roche D, Yoshimura S, Nahara I, Sahker E, et al. Ultrasound guidance versus anatomical landmarks for neuraxial anaesthesia in adults. Cochrane Database Syst Rev. 2025;5:CD014964. doi:10.1002/14651858.CD014964.pub2.</w:t>
       </w:r>
     </w:p>
     <w:p>
@@ -1519,67 +3118,7 @@
           <w:i w:val="0"/>
           <w:sz w:val="24"/>
         </w:rPr>
-        <w:t xml:space="preserve">Cantumkan gambar posisi transduser untuk </w:t>
-      </w:r>
-      <w:r>
-        <w:rPr>
-          <w:rFonts w:ascii="Times New Roman" w:hAnsi="Times New Roman" w:eastAsia="Times New Roman"/>
-          <w:b w:val="0"/>
-          <w:i/>
-          <w:sz w:val="24"/>
-        </w:rPr>
-        <w:t>transverse interspinous view</w:t>
-      </w:r>
-      <w:r>
-        <w:rPr>
-          <w:rFonts w:ascii="Times New Roman" w:hAnsi="Times New Roman" w:eastAsia="Times New Roman"/>
-          <w:b w:val="0"/>
-          <w:i w:val="0"/>
-          <w:sz w:val="24"/>
-        </w:rPr>
-        <w:t xml:space="preserve"> dan </w:t>
-      </w:r>
-      <w:r>
-        <w:rPr>
-          <w:rFonts w:ascii="Times New Roman" w:hAnsi="Times New Roman" w:eastAsia="Times New Roman"/>
-          <w:b w:val="0"/>
-          <w:i/>
-          <w:sz w:val="24"/>
-        </w:rPr>
-        <w:t>paramedian sagittal oblique view</w:t>
-      </w:r>
-      <w:r>
-        <w:rPr>
-          <w:rFonts w:ascii="Times New Roman" w:hAnsi="Times New Roman" w:eastAsia="Times New Roman"/>
-          <w:b w:val="0"/>
-          <w:i w:val="0"/>
-          <w:sz w:val="24"/>
-        </w:rPr>
-        <w:t>. Gambar ini sangat penting karena merupakan inti dari pembahasan teknis ultrasonografi tulang belakang. Sumber yang paling sesuai ialah `usg spine hadzics textbook RA and pain_Extracted.pdf` dan `Ultrasound guidance for neuraxial anesthesia techniques - UpToDate.pdf`.[3,5]</w:t>
-      </w:r>
-    </w:p>
-    <w:p/>
-    <w:p>
-      <w:pPr>
-        <w:jc w:val="both"/>
-      </w:pPr>
-      <w:r>
-        <w:rPr>
-          <w:rFonts w:ascii="Times New Roman" w:hAnsi="Times New Roman" w:eastAsia="Times New Roman"/>
-          <w:b w:val="0"/>
-          <w:i w:val="0"/>
-          <w:sz w:val="24"/>
-        </w:rPr>
-        <w:t xml:space="preserve">5. </w:t>
-      </w:r>
-      <w:r>
-        <w:rPr>
-          <w:rFonts w:ascii="Times New Roman" w:hAnsi="Times New Roman" w:eastAsia="Times New Roman"/>
-          <w:b/>
-          <w:i w:val="0"/>
-          <w:sz w:val="24"/>
-        </w:rPr>
-        <w:t>Gambar pola sonografi tulang belakang</w:t>
+        <w:t>5. Kwok WH, Karmakar MK. Spinal sonography and considerations for ultrasound-guided central neuraxial blockade. In: Hadzic A, Carrera A, Clark T, Gadsden J, Karmakar M, Sala-Blanch X, et al., editors. Hadzic’s Peripheral Nerve Blocks and Anatomy for Ultrasound-Guided Regional Anesthesia. 2nd ed. New York: McGraw-Hill Medical; 2012. p. 475.</w:t>
       </w:r>
     </w:p>
     <w:p>
@@ -1593,85 +3132,7 @@
           <w:i w:val="0"/>
           <w:sz w:val="24"/>
         </w:rPr>
-        <w:t xml:space="preserve">Cantumkan gambar yang menunjukkan bayangan akustik tulang, pola </w:t>
-      </w:r>
-      <w:r>
-        <w:rPr>
-          <w:rFonts w:ascii="Times New Roman" w:hAnsi="Times New Roman" w:eastAsia="Times New Roman"/>
-          <w:b w:val="0"/>
-          <w:i/>
-          <w:sz w:val="24"/>
-        </w:rPr>
-        <w:t>sawtooth</w:t>
-      </w:r>
-      <w:r>
-        <w:rPr>
-          <w:rFonts w:ascii="Times New Roman" w:hAnsi="Times New Roman" w:eastAsia="Times New Roman"/>
-          <w:b w:val="0"/>
-          <w:i w:val="0"/>
-          <w:sz w:val="24"/>
-        </w:rPr>
-        <w:t xml:space="preserve">, </w:t>
-      </w:r>
-      <w:r>
-        <w:rPr>
-          <w:rFonts w:ascii="Times New Roman" w:hAnsi="Times New Roman" w:eastAsia="Times New Roman"/>
-          <w:b w:val="0"/>
-          <w:i/>
-          <w:sz w:val="24"/>
-        </w:rPr>
-        <w:t>posterior complex</w:t>
-      </w:r>
-      <w:r>
-        <w:rPr>
-          <w:rFonts w:ascii="Times New Roman" w:hAnsi="Times New Roman" w:eastAsia="Times New Roman"/>
-          <w:b w:val="0"/>
-          <w:i w:val="0"/>
-          <w:sz w:val="24"/>
-        </w:rPr>
-        <w:t xml:space="preserve">, dan </w:t>
-      </w:r>
-      <w:r>
-        <w:rPr>
-          <w:rFonts w:ascii="Times New Roman" w:hAnsi="Times New Roman" w:eastAsia="Times New Roman"/>
-          <w:b w:val="0"/>
-          <w:i/>
-          <w:sz w:val="24"/>
-        </w:rPr>
-        <w:t>anterior complex</w:t>
-      </w:r>
-      <w:r>
-        <w:rPr>
-          <w:rFonts w:ascii="Times New Roman" w:hAnsi="Times New Roman" w:eastAsia="Times New Roman"/>
-          <w:b w:val="0"/>
-          <w:i w:val="0"/>
-          <w:sz w:val="24"/>
-        </w:rPr>
-        <w:t>. Gambar ini membantu pembaca memahami bagaimana struktur target dikenali pada layar USG. Sumber yang paling sesuai ialah `usg spine hadzics textbook RA and pain_Extracted.pdf`.[3,5]</w:t>
-      </w:r>
-    </w:p>
-    <w:p/>
-    <w:p>
-      <w:pPr>
-        <w:jc w:val="both"/>
-      </w:pPr>
-      <w:r>
-        <w:rPr>
-          <w:rFonts w:ascii="Times New Roman" w:hAnsi="Times New Roman" w:eastAsia="Times New Roman"/>
-          <w:b w:val="0"/>
-          <w:i w:val="0"/>
-          <w:sz w:val="24"/>
-        </w:rPr>
-        <w:t xml:space="preserve">6. </w:t>
-      </w:r>
-      <w:r>
-        <w:rPr>
-          <w:rFonts w:ascii="Times New Roman" w:hAnsi="Times New Roman" w:eastAsia="Times New Roman"/>
-          <w:b/>
-          <w:i w:val="0"/>
-          <w:sz w:val="24"/>
-        </w:rPr>
-        <w:t>Gambar penentuan kedalaman ruang epidural</w:t>
+        <w:t>6. Pardo MC Jr. Spinal, epidural, and caudal anesthesia. In: Pardo MC Jr, editor. Miller’s Basics of Anesthesia. 8th ed. Philadelphia: Elsevier; 2023.</w:t>
       </w:r>
     </w:p>
     <w:p>
@@ -1685,183 +3146,7 @@
           <w:i w:val="0"/>
           <w:sz w:val="24"/>
         </w:rPr>
-        <w:t>Cantumkan gambar atau tangkapan citra yang memperlihatkan pengukuran dari kulit ke ruang epidural. Gambar ini sangat penting untuk menjelaskan manfaat ultrasonografi pra-tindakan. Sumber yang paling sesuai ialah `Pre-Procedural Lumbar Neuraxial Ultrasound—A Systematic.pdf` dan `Ultrasound guidance for neuraxial anesthesia techniques - UpToDate.pdf`.[2,3]</w:t>
-      </w:r>
-    </w:p>
-    <w:p/>
-    <w:p>
-      <w:pPr>
-        <w:jc w:val="both"/>
-      </w:pPr>
-      <w:r>
-        <w:rPr>
-          <w:rFonts w:ascii="Times New Roman" w:hAnsi="Times New Roman" w:eastAsia="Times New Roman"/>
-          <w:b w:val="0"/>
-          <w:i w:val="0"/>
-          <w:sz w:val="24"/>
-        </w:rPr>
-        <w:t xml:space="preserve">7. </w:t>
-      </w:r>
-      <w:r>
-        <w:rPr>
-          <w:rFonts w:ascii="Times New Roman" w:hAnsi="Times New Roman" w:eastAsia="Times New Roman"/>
-          <w:b/>
-          <w:i w:val="0"/>
-          <w:sz w:val="24"/>
-        </w:rPr>
-        <w:t>Gambar algoritme pindaian pra-tindakan</w:t>
-      </w:r>
-    </w:p>
-    <w:p>
-      <w:pPr>
-        <w:jc w:val="both"/>
-      </w:pPr>
-      <w:r>
-        <w:rPr>
-          <w:rFonts w:ascii="Times New Roman" w:hAnsi="Times New Roman" w:eastAsia="Times New Roman"/>
-          <w:b w:val="0"/>
-          <w:i w:val="0"/>
-          <w:sz w:val="24"/>
-        </w:rPr>
-        <w:t>Cantumkan ilustrasi langkah pindaian dari identifikasi sakrum, penghitungan sela L5-S1 ke kranial, penentuan garis tengah, hingga penandaan titik pungsi. Gambar ini akan membuat bagian prosedur menjadi jauh lebih mudah dipahami. Sumber yang paling sesuai ialah `Ultrasound guidance for neuraxial anesthesia techniques - UpToDate.pdf` dan `usg spine hadzics textbook RA and pain_Extracted.pdf`.[3,5]</w:t>
-      </w:r>
-    </w:p>
-    <w:p/>
-    <w:p>
-      <w:pPr>
-        <w:jc w:val="both"/>
-      </w:pPr>
-      <w:r>
-        <w:rPr>
-          <w:rFonts w:ascii="Times New Roman" w:hAnsi="Times New Roman" w:eastAsia="Times New Roman"/>
-          <w:b w:val="0"/>
-          <w:i w:val="0"/>
-          <w:sz w:val="24"/>
-        </w:rPr>
-        <w:t xml:space="preserve">8. </w:t>
-      </w:r>
-      <w:r>
-        <w:rPr>
-          <w:rFonts w:ascii="Times New Roman" w:hAnsi="Times New Roman" w:eastAsia="Times New Roman"/>
-          <w:b/>
-          <w:i w:val="0"/>
-          <w:sz w:val="24"/>
-        </w:rPr>
-        <w:t>Gambar manfaat USG pada pasien obstetri atau pasien dengan penanda anatomi sulit</w:t>
-      </w:r>
-    </w:p>
-    <w:p>
-      <w:pPr>
-        <w:jc w:val="both"/>
-      </w:pPr>
-      <w:r>
-        <w:rPr>
-          <w:rFonts w:ascii="Times New Roman" w:hAnsi="Times New Roman" w:eastAsia="Times New Roman"/>
-          <w:b w:val="0"/>
-          <w:i w:val="0"/>
-          <w:sz w:val="24"/>
-        </w:rPr>
-        <w:t>Bila tersedia, cantumkan gambar yang menunjukkan perbedaan kejelasan penanda anatomi pada pasien sulit atau gambar sonografi yang lebih membantu pada populasi obstetri. Sumber yang paling sesuai untuk mendukung narasi ini ialah `Anaesthesia - 2020 - Young - Conventional landmark palpation vs  preprocedural ultrasound for neuraxial analgesia and.pdf` dan `cochrane Ultrasound guidance versus anatomical landmarks for neuraxial.pdf`.[1,4]</w:t>
-      </w:r>
-    </w:p>
-    <w:p/>
-    <w:p>
-      <w:pPr>
-        <w:pStyle w:val="Heading1"/>
-      </w:pPr>
-      <w:r>
-        <w:rPr>
-          <w:rFonts w:ascii="Times New Roman" w:hAnsi="Times New Roman" w:eastAsia="Times New Roman"/>
-          <w:b/>
-          <w:i w:val="0"/>
-          <w:sz w:val="24"/>
-        </w:rPr>
-        <w:t>Daftar Pustaka</w:t>
-      </w:r>
-    </w:p>
-    <w:p/>
-    <w:p>
-      <w:pPr>
-        <w:jc w:val="both"/>
-      </w:pPr>
-      <w:r>
-        <w:rPr>
-          <w:rFonts w:ascii="Times New Roman" w:hAnsi="Times New Roman" w:eastAsia="Times New Roman"/>
-          <w:b w:val="0"/>
-          <w:i w:val="0"/>
-          <w:sz w:val="24"/>
-        </w:rPr>
-        <w:t>1. Young B, Onwochei D, Desai N. Conventional landmark palpation vs preprocedural ultrasound for neuraxial analgesia and anaesthesia in obstetrics: a systematic review and meta-analysis with trial sequential analyses. Anaesthesia. 2020;75(8):1001-1016. doi:10.1111/anae.15072.</w:t>
-      </w:r>
-    </w:p>
-    <w:p>
-      <w:pPr>
-        <w:jc w:val="both"/>
-      </w:pPr>
-      <w:r>
-        <w:rPr>
-          <w:rFonts w:ascii="Times New Roman" w:hAnsi="Times New Roman" w:eastAsia="Times New Roman"/>
-          <w:b w:val="0"/>
-          <w:i w:val="0"/>
-          <w:sz w:val="24"/>
-        </w:rPr>
-        <w:t>2. Sidiropoulou T, Christodoulaki K, Siristatidis C. Pre-procedural lumbar neuraxial ultrasound: a systematic review of randomized controlled trials and meta-analysis. Healthcare (Basel). 2021;9(4):479. doi:10.3390/healthcare9040479.</w:t>
-      </w:r>
-    </w:p>
-    <w:p>
-      <w:pPr>
-        <w:jc w:val="both"/>
-      </w:pPr>
-      <w:r>
-        <w:rPr>
-          <w:rFonts w:ascii="Times New Roman" w:hAnsi="Times New Roman" w:eastAsia="Times New Roman"/>
-          <w:b w:val="0"/>
-          <w:i w:val="0"/>
-          <w:sz w:val="24"/>
-        </w:rPr>
-        <w:t>3. Kamdar BB, Hao D. Ultrasound guidance for neuraxial anesthesia techniques. UpToDate. Waltham, MA: Wolters Kluwer; 2024 Oct 9. Available from: https://www.uptodate.com.</w:t>
-      </w:r>
-    </w:p>
-    <w:p>
-      <w:pPr>
-        <w:jc w:val="both"/>
-      </w:pPr>
-      <w:r>
-        <w:rPr>
-          <w:rFonts w:ascii="Times New Roman" w:hAnsi="Times New Roman" w:eastAsia="Times New Roman"/>
-          <w:b w:val="0"/>
-          <w:i w:val="0"/>
-          <w:sz w:val="24"/>
-        </w:rPr>
-        <w:t>4. Makino Y, Miyake K, Roche D, Yoshimura S, Nahara I, Sahker E, et al. Ultrasound guidance versus anatomical landmarks for neuraxial anaesthesia in adults. Cochrane Database Syst Rev. 2025;5:CD014964. doi:10.1002/14651858.CD014964.pub2.</w:t>
-      </w:r>
-    </w:p>
-    <w:p>
-      <w:pPr>
-        <w:jc w:val="both"/>
-      </w:pPr>
-      <w:r>
-        <w:rPr>
-          <w:rFonts w:ascii="Times New Roman" w:hAnsi="Times New Roman" w:eastAsia="Times New Roman"/>
-          <w:b w:val="0"/>
-          <w:i w:val="0"/>
-          <w:sz w:val="24"/>
-        </w:rPr>
-        <w:t>5. Kwok WH, Karmakar MK. Spinal sonography and considerations for ultrasound-guided central neuraxial blockade. In: Hadzic A, Carrera A, Clark T, Gadsden J, Karmakar M, Sala-Blanch X, et al., editors. Hadzic’s Peripheral Nerve Blocks and Anatomy for Ultrasound-Guided Regional Anesthesia. 2nd ed. New York: McGraw-Hill Medical; 2012. p. 475.</w:t>
-      </w:r>
-    </w:p>
-    <w:p>
-      <w:pPr>
-        <w:jc w:val="both"/>
-      </w:pPr>
-      <w:r>
-        <w:rPr>
-          <w:rFonts w:ascii="Times New Roman" w:hAnsi="Times New Roman" w:eastAsia="Times New Roman"/>
-          <w:b w:val="0"/>
-          <w:i w:val="0"/>
-          <w:sz w:val="24"/>
-        </w:rPr>
-        <w:t>6. Pardo MC Jr. Spinal, epidural, and caudal anesthesia. In: Pardo MC Jr, editor. Miller’s Basics of Anesthesia. 8th ed. Philadelphia: Elsevier; 2023.</w:t>
+        <w:t>7. Gropper MA, editor. Miller’s Anesthesia. 10th ed. Philadelphia: Elsevier; 2024.</w:t>
       </w:r>
     </w:p>
     <w:sectPr>

</xml_diff>